<commit_message>
26-03-30, Kooistra blog bijgewerkt
</commit_message>
<xml_diff>
--- a/BlogsWord/Stapstenenomrichtingtegeven.docx
+++ b/BlogsWord/Stapstenenomrichtingtegeven.docx
@@ -81,29 +81,7 @@
           <w:szCs w:val="22"/>
           <w:lang w:val="nl-NL"/>
         </w:rPr>
-        <w:t>beroeps</w:t>
-      </w:r>
-      <w:r>
-        <w:rPr>
-          <w:rFonts w:ascii="Courier New" w:hAnsi="Courier New" w:cs="Courier New"/>
-          <w:i/>
-          <w:iCs/>
-          <w:sz w:val="22"/>
-          <w:szCs w:val="22"/>
-          <w:lang w:val="nl-NL"/>
-        </w:rPr>
-        <w:t>-</w:t>
-      </w:r>
-      <w:r>
-        <w:rPr>
-          <w:rFonts w:ascii="Courier New" w:hAnsi="Courier New" w:cs="Courier New"/>
-          <w:i/>
-          <w:iCs/>
-          <w:sz w:val="22"/>
-          <w:szCs w:val="22"/>
-          <w:lang w:val="nl-NL"/>
-        </w:rPr>
-        <w:t>bevolking</w:t>
+        <w:t>beroeps-bevolking</w:t>
       </w:r>
       <w:proofErr w:type="spellEnd"/>
       <w:r>
@@ -173,6 +151,17 @@
           <w:lang w:val="nl-NL"/>
         </w:rPr>
       </w:pPr>
+    </w:p>
+    <w:p>
+      <w:pPr>
+        <w:spacing w:line="360" w:lineRule="auto"/>
+        <w:rPr>
+          <w:rFonts w:ascii="Courier New" w:hAnsi="Courier New" w:cs="Courier New"/>
+          <w:sz w:val="22"/>
+          <w:szCs w:val="22"/>
+          <w:lang w:val="nl-NL"/>
+        </w:rPr>
+      </w:pPr>
       <w:r>
         <w:rPr>
           <w:rFonts w:ascii="Courier New" w:hAnsi="Courier New" w:cs="Courier New"/>
@@ -319,7 +308,25 @@
           <w:szCs w:val="22"/>
           <w:lang w:val="nl-NL"/>
         </w:rPr>
-        <w:t xml:space="preserve">de politici die er beslissingen over moeten nemen, weten </w:t>
+        <w:t xml:space="preserve">de politici die er beslissingen over </w:t>
+      </w:r>
+      <w:r>
+        <w:rPr>
+          <w:rFonts w:ascii="Courier New" w:hAnsi="Courier New" w:cs="Courier New"/>
+          <w:sz w:val="22"/>
+          <w:szCs w:val="22"/>
+          <w:lang w:val="nl-NL"/>
+        </w:rPr>
+        <w:t>hebben te</w:t>
+      </w:r>
+      <w:r>
+        <w:rPr>
+          <w:rFonts w:ascii="Courier New" w:hAnsi="Courier New" w:cs="Courier New"/>
+          <w:sz w:val="22"/>
+          <w:szCs w:val="22"/>
+          <w:lang w:val="nl-NL"/>
+        </w:rPr>
+        <w:t xml:space="preserve"> nemen, weten </w:t>
       </w:r>
       <w:r>
         <w:rPr>
@@ -355,7 +362,7 @@
           <w:szCs w:val="22"/>
           <w:lang w:val="nl-NL"/>
         </w:rPr>
-        <w:t>Het is allemaal</w:t>
+        <w:t>Het is</w:t>
       </w:r>
       <w:r>
         <w:rPr>
@@ -418,7 +425,34 @@
           <w:szCs w:val="22"/>
           <w:lang w:val="nl-NL"/>
         </w:rPr>
-        <w:t xml:space="preserve">Hij schrijft dat we met elkaar in een soort drijfzand terecht zijn gekomen en dat we stapstenen nodig hebben om eruit te komen en richting te geven. </w:t>
+        <w:t>Kooiman</w:t>
+      </w:r>
+      <w:r>
+        <w:rPr>
+          <w:rFonts w:ascii="Courier New" w:hAnsi="Courier New" w:cs="Courier New"/>
+          <w:sz w:val="22"/>
+          <w:szCs w:val="22"/>
+          <w:lang w:val="nl-NL"/>
+        </w:rPr>
+        <w:t xml:space="preserve"> schrijft dat we </w:t>
+      </w:r>
+      <w:r>
+        <w:rPr>
+          <w:rFonts w:ascii="Courier New" w:hAnsi="Courier New" w:cs="Courier New"/>
+          <w:sz w:val="22"/>
+          <w:szCs w:val="22"/>
+          <w:lang w:val="nl-NL"/>
+        </w:rPr>
+        <w:t xml:space="preserve">hier </w:t>
+      </w:r>
+      <w:r>
+        <w:rPr>
+          <w:rFonts w:ascii="Courier New" w:hAnsi="Courier New" w:cs="Courier New"/>
+          <w:sz w:val="22"/>
+          <w:szCs w:val="22"/>
+          <w:lang w:val="nl-NL"/>
+        </w:rPr>
+        <w:t xml:space="preserve">met elkaar in een soort drijfzand terecht zijn gekomen en dat we stapstenen nodig hebben om eruit te komen en richting te geven. </w:t>
       </w:r>
     </w:p>
     <w:p>
@@ -502,7 +536,25 @@
           <w:szCs w:val="22"/>
           <w:lang w:val="nl-NL"/>
         </w:rPr>
-        <w:t xml:space="preserve">, zoals Kooiman dat in dit boek doet, </w:t>
+        <w:t xml:space="preserve">, zoals Kooiman dat </w:t>
+      </w:r>
+      <w:r>
+        <w:rPr>
+          <w:rFonts w:ascii="Courier New" w:hAnsi="Courier New" w:cs="Courier New"/>
+          <w:sz w:val="22"/>
+          <w:szCs w:val="22"/>
+          <w:lang w:val="nl-NL"/>
+        </w:rPr>
+        <w:t xml:space="preserve">met ons </w:t>
+      </w:r>
+      <w:r>
+        <w:rPr>
+          <w:rFonts w:ascii="Courier New" w:hAnsi="Courier New" w:cs="Courier New"/>
+          <w:sz w:val="22"/>
+          <w:szCs w:val="22"/>
+          <w:lang w:val="nl-NL"/>
+        </w:rPr>
+        <w:t xml:space="preserve">in dit boek doet, </w:t>
       </w:r>
       <w:r>
         <w:rPr>
@@ -538,43 +590,52 @@
           <w:szCs w:val="22"/>
           <w:lang w:val="nl-NL"/>
         </w:rPr>
-        <w:t xml:space="preserve">niet alleen iets zou moeten zijn voor een kleine, selecte groep. Belasting is </w:t>
-      </w:r>
-      <w:r>
-        <w:rPr>
-          <w:rFonts w:ascii="Courier New" w:hAnsi="Courier New" w:cs="Courier New"/>
-          <w:sz w:val="22"/>
-          <w:szCs w:val="22"/>
-          <w:lang w:val="nl-NL"/>
-        </w:rPr>
-        <w:t xml:space="preserve">uitstek een </w:t>
-      </w:r>
-      <w:r>
-        <w:rPr>
-          <w:rFonts w:ascii="Courier New" w:hAnsi="Courier New" w:cs="Courier New"/>
-          <w:sz w:val="22"/>
-          <w:szCs w:val="22"/>
-          <w:lang w:val="nl-NL"/>
-        </w:rPr>
-        <w:t xml:space="preserve">onderwerp waar we met elkaar over hebben te praten en is een </w:t>
-      </w:r>
-      <w:r>
-        <w:rPr>
-          <w:rFonts w:ascii="Courier New" w:hAnsi="Courier New" w:cs="Courier New"/>
-          <w:sz w:val="22"/>
-          <w:szCs w:val="22"/>
-          <w:lang w:val="nl-NL"/>
-        </w:rPr>
-        <w:t>publieke zaak</w:t>
-      </w:r>
-      <w:r>
-        <w:rPr>
-          <w:rFonts w:ascii="Courier New" w:hAnsi="Courier New" w:cs="Courier New"/>
-          <w:sz w:val="22"/>
-          <w:szCs w:val="22"/>
-          <w:lang w:val="nl-NL"/>
-        </w:rPr>
-        <w:t>. De basisgedachten van het hele belastingstelsel gaa</w:t>
+        <w:t xml:space="preserve">niet </w:t>
+      </w:r>
+      <w:r>
+        <w:rPr>
+          <w:rFonts w:ascii="Courier New" w:hAnsi="Courier New" w:cs="Courier New"/>
+          <w:sz w:val="22"/>
+          <w:szCs w:val="22"/>
+          <w:lang w:val="nl-NL"/>
+        </w:rPr>
+        <w:t xml:space="preserve">meer </w:t>
+      </w:r>
+      <w:r>
+        <w:rPr>
+          <w:rFonts w:ascii="Courier New" w:hAnsi="Courier New" w:cs="Courier New"/>
+          <w:sz w:val="22"/>
+          <w:szCs w:val="22"/>
+          <w:lang w:val="nl-NL"/>
+        </w:rPr>
+        <w:t>alleen iets zou moeten zijn voor een kleine, selecte groep</w:t>
+      </w:r>
+      <w:r>
+        <w:rPr>
+          <w:rFonts w:ascii="Courier New" w:hAnsi="Courier New" w:cs="Courier New"/>
+          <w:sz w:val="22"/>
+          <w:szCs w:val="22"/>
+          <w:lang w:val="nl-NL"/>
+        </w:rPr>
+        <w:t xml:space="preserve"> experts</w:t>
+      </w:r>
+      <w:r>
+        <w:rPr>
+          <w:rFonts w:ascii="Courier New" w:hAnsi="Courier New" w:cs="Courier New"/>
+          <w:sz w:val="22"/>
+          <w:szCs w:val="22"/>
+          <w:lang w:val="nl-NL"/>
+        </w:rPr>
+        <w:t>.</w:t>
+      </w:r>
+      <w:r>
+        <w:rPr>
+          <w:rFonts w:ascii="Courier New" w:hAnsi="Courier New" w:cs="Courier New"/>
+          <w:sz w:val="22"/>
+          <w:szCs w:val="22"/>
+          <w:lang w:val="nl-NL"/>
+        </w:rPr>
+        <w:t xml:space="preserve"> De basisgedachten van het hele belastingstelsel gaa</w:t>
       </w:r>
       <w:r>
         <w:rPr>
@@ -682,7 +743,25 @@
           <w:szCs w:val="22"/>
           <w:lang w:val="nl-NL"/>
         </w:rPr>
-        <w:t xml:space="preserve">gebeurt. Belastingrecht is in de geschiedenis zwaar bevochten en dat gevecht </w:t>
+        <w:t xml:space="preserve">gebeurt. </w:t>
+      </w:r>
+      <w:r>
+        <w:rPr>
+          <w:rFonts w:ascii="Courier New" w:hAnsi="Courier New" w:cs="Courier New"/>
+          <w:sz w:val="22"/>
+          <w:szCs w:val="22"/>
+          <w:lang w:val="nl-NL"/>
+        </w:rPr>
+        <w:t xml:space="preserve">Belasting is een publieke zaak. </w:t>
+      </w:r>
+      <w:r>
+        <w:rPr>
+          <w:rFonts w:ascii="Courier New" w:hAnsi="Courier New" w:cs="Courier New"/>
+          <w:sz w:val="22"/>
+          <w:szCs w:val="22"/>
+          <w:lang w:val="nl-NL"/>
+        </w:rPr>
+        <w:t xml:space="preserve">Belastingrecht is in de geschiedenis zwaar bevochten en dat gevecht </w:t>
       </w:r>
       <w:r>
         <w:rPr>
@@ -709,16 +788,52 @@
           <w:szCs w:val="22"/>
           <w:lang w:val="nl-NL"/>
         </w:rPr>
-        <w:t>op andere gedachten brengt,</w:t>
-      </w:r>
-      <w:r>
-        <w:rPr>
-          <w:rFonts w:ascii="Courier New" w:hAnsi="Courier New" w:cs="Courier New"/>
-          <w:sz w:val="22"/>
-          <w:szCs w:val="22"/>
-          <w:lang w:val="nl-NL"/>
-        </w:rPr>
-        <w:t xml:space="preserve"> niet door over tarieven en boxen te praten maar over de geschiedenis </w:t>
+        <w:t xml:space="preserve">op andere gedachten </w:t>
+      </w:r>
+      <w:r>
+        <w:rPr>
+          <w:rFonts w:ascii="Courier New" w:hAnsi="Courier New" w:cs="Courier New"/>
+          <w:sz w:val="22"/>
+          <w:szCs w:val="22"/>
+          <w:lang w:val="nl-NL"/>
+        </w:rPr>
+        <w:t xml:space="preserve">probeert te </w:t>
+      </w:r>
+      <w:r>
+        <w:rPr>
+          <w:rFonts w:ascii="Courier New" w:hAnsi="Courier New" w:cs="Courier New"/>
+          <w:sz w:val="22"/>
+          <w:szCs w:val="22"/>
+          <w:lang w:val="nl-NL"/>
+        </w:rPr>
+        <w:t>breng</w:t>
+      </w:r>
+      <w:r>
+        <w:rPr>
+          <w:rFonts w:ascii="Courier New" w:hAnsi="Courier New" w:cs="Courier New"/>
+          <w:sz w:val="22"/>
+          <w:szCs w:val="22"/>
+          <w:lang w:val="nl-NL"/>
+        </w:rPr>
+        <w:t>en</w:t>
+      </w:r>
+      <w:r>
+        <w:rPr>
+          <w:rFonts w:ascii="Courier New" w:hAnsi="Courier New" w:cs="Courier New"/>
+          <w:sz w:val="22"/>
+          <w:szCs w:val="22"/>
+          <w:lang w:val="nl-NL"/>
+        </w:rPr>
+        <w:t>,</w:t>
+      </w:r>
+      <w:r>
+        <w:rPr>
+          <w:rFonts w:ascii="Courier New" w:hAnsi="Courier New" w:cs="Courier New"/>
+          <w:sz w:val="22"/>
+          <w:szCs w:val="22"/>
+          <w:lang w:val="nl-NL"/>
+        </w:rPr>
+        <w:t xml:space="preserve"> niet door over tarieven en boxen te praten maar over de </w:t>
       </w:r>
       <w:r>
         <w:rPr>
@@ -728,7 +843,7 @@
           <w:lang w:val="nl-NL"/>
         </w:rPr>
         <w:lastRenderedPageBreak/>
-        <w:t>ervan</w:t>
+        <w:t>geschiedenis ervan</w:t>
       </w:r>
       <w:r>
         <w:rPr>
@@ -746,16 +861,43 @@
           <w:szCs w:val="22"/>
           <w:lang w:val="nl-NL"/>
         </w:rPr>
-        <w:t xml:space="preserve"> de principes en </w:t>
-      </w:r>
-      <w:r>
-        <w:rPr>
-          <w:rFonts w:ascii="Courier New" w:hAnsi="Courier New" w:cs="Courier New"/>
-          <w:sz w:val="22"/>
-          <w:szCs w:val="22"/>
-          <w:lang w:val="nl-NL"/>
-        </w:rPr>
-        <w:t>ons laat na</w:t>
+        <w:t xml:space="preserve"> de principes </w:t>
+      </w:r>
+      <w:r>
+        <w:rPr>
+          <w:rFonts w:ascii="Courier New" w:hAnsi="Courier New" w:cs="Courier New"/>
+          <w:sz w:val="22"/>
+          <w:szCs w:val="22"/>
+          <w:lang w:val="nl-NL"/>
+        </w:rPr>
+        <w:t xml:space="preserve">eronder. Kooiman </w:t>
+      </w:r>
+      <w:r>
+        <w:rPr>
+          <w:rFonts w:ascii="Courier New" w:hAnsi="Courier New" w:cs="Courier New"/>
+          <w:sz w:val="22"/>
+          <w:szCs w:val="22"/>
+          <w:lang w:val="nl-NL"/>
+        </w:rPr>
+        <w:t xml:space="preserve">laat </w:t>
+      </w:r>
+      <w:r>
+        <w:rPr>
+          <w:rFonts w:ascii="Courier New" w:hAnsi="Courier New" w:cs="Courier New"/>
+          <w:sz w:val="22"/>
+          <w:szCs w:val="22"/>
+          <w:lang w:val="nl-NL"/>
+        </w:rPr>
+        <w:t xml:space="preserve">ons </w:t>
+      </w:r>
+      <w:r>
+        <w:rPr>
+          <w:rFonts w:ascii="Courier New" w:hAnsi="Courier New" w:cs="Courier New"/>
+          <w:sz w:val="22"/>
+          <w:szCs w:val="22"/>
+          <w:lang w:val="nl-NL"/>
+        </w:rPr>
+        <w:t>na</w:t>
       </w:r>
       <w:r>
         <w:rPr>
@@ -1157,7 +1299,25 @@
           <w:szCs w:val="22"/>
           <w:lang w:val="nl-NL"/>
         </w:rPr>
-        <w:t xml:space="preserve"> mensen ook wat terug</w:t>
+        <w:t xml:space="preserve"> mensen </w:t>
+      </w:r>
+      <w:r>
+        <w:rPr>
+          <w:rFonts w:ascii="Courier New" w:hAnsi="Courier New" w:cs="Courier New"/>
+          <w:sz w:val="22"/>
+          <w:szCs w:val="22"/>
+          <w:lang w:val="nl-NL"/>
+        </w:rPr>
+        <w:t>daarvoor</w:t>
+      </w:r>
+      <w:r>
+        <w:rPr>
+          <w:rFonts w:ascii="Courier New" w:hAnsi="Courier New" w:cs="Courier New"/>
+          <w:sz w:val="22"/>
+          <w:szCs w:val="22"/>
+          <w:lang w:val="nl-NL"/>
+        </w:rPr>
+        <w:t xml:space="preserve"> wat terug</w:t>
       </w:r>
       <w:r>
         <w:rPr>
@@ -1301,7 +1461,25 @@
           <w:szCs w:val="22"/>
           <w:lang w:val="nl-NL"/>
         </w:rPr>
-        <w:t xml:space="preserve"> en over de grenzen. Wie ho</w:t>
+        <w:t xml:space="preserve"> en over de grenzen</w:t>
+      </w:r>
+      <w:r>
+        <w:rPr>
+          <w:rFonts w:ascii="Courier New" w:hAnsi="Courier New" w:cs="Courier New"/>
+          <w:sz w:val="22"/>
+          <w:szCs w:val="22"/>
+          <w:lang w:val="nl-NL"/>
+        </w:rPr>
+        <w:t>; w</w:t>
+      </w:r>
+      <w:r>
+        <w:rPr>
+          <w:rFonts w:ascii="Courier New" w:hAnsi="Courier New" w:cs="Courier New"/>
+          <w:sz w:val="22"/>
+          <w:szCs w:val="22"/>
+          <w:lang w:val="nl-NL"/>
+        </w:rPr>
+        <w:t>ie ho</w:t>
       </w:r>
       <w:r>
         <w:rPr>
@@ -1799,16 +1977,34 @@
           <w:szCs w:val="22"/>
           <w:lang w:val="nl-NL"/>
         </w:rPr>
-        <w:t>Tegelijk konden meer mensen stemmen en werd de maatschappelijk inbreng verbreedt</w:t>
-      </w:r>
-      <w:r>
-        <w:rPr>
-          <w:rFonts w:ascii="Courier New" w:hAnsi="Courier New" w:cs="Courier New"/>
-          <w:sz w:val="22"/>
-          <w:szCs w:val="22"/>
-          <w:lang w:val="nl-NL"/>
-        </w:rPr>
-        <w:t xml:space="preserve"> en werden de privileges van de adel en de kerk afgebouwd. </w:t>
+        <w:t>Tegelijk konden meer mensen stemmen en werd</w:t>
+      </w:r>
+      <w:r>
+        <w:rPr>
+          <w:rFonts w:ascii="Courier New" w:hAnsi="Courier New" w:cs="Courier New"/>
+          <w:sz w:val="22"/>
+          <w:szCs w:val="22"/>
+          <w:lang w:val="nl-NL"/>
+        </w:rPr>
+        <w:t>en</w:t>
+      </w:r>
+      <w:r>
+        <w:rPr>
+          <w:rFonts w:ascii="Courier New" w:hAnsi="Courier New" w:cs="Courier New"/>
+          <w:sz w:val="22"/>
+          <w:szCs w:val="22"/>
+          <w:lang w:val="nl-NL"/>
+        </w:rPr>
+        <w:t xml:space="preserve"> de maatschappelijk inbreng verbreedt</w:t>
+      </w:r>
+      <w:r>
+        <w:rPr>
+          <w:rFonts w:ascii="Courier New" w:hAnsi="Courier New" w:cs="Courier New"/>
+          <w:sz w:val="22"/>
+          <w:szCs w:val="22"/>
+          <w:lang w:val="nl-NL"/>
+        </w:rPr>
+        <w:t xml:space="preserve"> en de privileges van de adel en de kerk afgebouwd. </w:t>
       </w:r>
       <w:r>
         <w:rPr>
@@ -1845,7 +2041,169 @@
           <w:szCs w:val="22"/>
           <w:lang w:val="nl-NL"/>
         </w:rPr>
-        <w:t xml:space="preserve">Een ander verschil is dat het open bijdragen aan de belasting als burgerschapsbijdrage werd gezien met een eerlijke bijdrage naar draagkracht plaats maakt voor verborgen belastingheffing als ideaal waardoor het ook steeds moeilijke wordt om te beoordelen of individuen of bedrijven wel voldoende betalen. </w:t>
+        <w:t>De</w:t>
+      </w:r>
+      <w:r>
+        <w:rPr>
+          <w:rFonts w:ascii="Courier New" w:hAnsi="Courier New" w:cs="Courier New"/>
+          <w:sz w:val="22"/>
+          <w:szCs w:val="22"/>
+          <w:lang w:val="nl-NL"/>
+        </w:rPr>
+        <w:t xml:space="preserve"> open bijdrage aan de belasting met een eerlijke </w:t>
+      </w:r>
+      <w:r>
+        <w:rPr>
+          <w:rFonts w:ascii="Courier New" w:hAnsi="Courier New" w:cs="Courier New"/>
+          <w:sz w:val="22"/>
+          <w:szCs w:val="22"/>
+          <w:lang w:val="nl-NL"/>
+        </w:rPr>
+        <w:t>afdracht</w:t>
+      </w:r>
+      <w:r>
+        <w:rPr>
+          <w:rFonts w:ascii="Courier New" w:hAnsi="Courier New" w:cs="Courier New"/>
+          <w:sz w:val="22"/>
+          <w:szCs w:val="22"/>
+          <w:lang w:val="nl-NL"/>
+        </w:rPr>
+        <w:t xml:space="preserve"> naar draagkracht plaats maakt voor verborgen belastingheffing als ideaal</w:t>
+      </w:r>
+      <w:r>
+        <w:rPr>
+          <w:rFonts w:ascii="Courier New" w:hAnsi="Courier New" w:cs="Courier New"/>
+          <w:sz w:val="22"/>
+          <w:szCs w:val="22"/>
+          <w:lang w:val="nl-NL"/>
+        </w:rPr>
+        <w:t>. Hierdoor werd</w:t>
+      </w:r>
+      <w:r>
+        <w:rPr>
+          <w:rFonts w:ascii="Courier New" w:hAnsi="Courier New" w:cs="Courier New"/>
+          <w:sz w:val="22"/>
+          <w:szCs w:val="22"/>
+          <w:lang w:val="nl-NL"/>
+        </w:rPr>
+        <w:t xml:space="preserve"> het ook steeds moeilijke</w:t>
+      </w:r>
+      <w:r>
+        <w:rPr>
+          <w:rFonts w:ascii="Courier New" w:hAnsi="Courier New" w:cs="Courier New"/>
+          <w:sz w:val="22"/>
+          <w:szCs w:val="22"/>
+          <w:lang w:val="nl-NL"/>
+        </w:rPr>
+        <w:t>r</w:t>
+      </w:r>
+      <w:r>
+        <w:rPr>
+          <w:rFonts w:ascii="Courier New" w:hAnsi="Courier New" w:cs="Courier New"/>
+          <w:sz w:val="22"/>
+          <w:szCs w:val="22"/>
+          <w:lang w:val="nl-NL"/>
+        </w:rPr>
+        <w:t xml:space="preserve"> om te beoordelen of individuen of bedrijven wel voldoende beta</w:t>
+      </w:r>
+      <w:r>
+        <w:rPr>
+          <w:rFonts w:ascii="Courier New" w:hAnsi="Courier New" w:cs="Courier New"/>
+          <w:sz w:val="22"/>
+          <w:szCs w:val="22"/>
+          <w:lang w:val="nl-NL"/>
+        </w:rPr>
+        <w:t>alden</w:t>
+      </w:r>
+      <w:r>
+        <w:rPr>
+          <w:rFonts w:ascii="Courier New" w:hAnsi="Courier New" w:cs="Courier New"/>
+          <w:sz w:val="22"/>
+          <w:szCs w:val="22"/>
+          <w:lang w:val="nl-NL"/>
+        </w:rPr>
+        <w:t>. Het zijn niet meer de juristen die aan de basis staan van het belastingstelsel, maar de economen.</w:t>
+      </w:r>
+      <w:r>
+        <w:rPr>
+          <w:rFonts w:ascii="Courier New" w:hAnsi="Courier New" w:cs="Courier New"/>
+          <w:sz w:val="22"/>
+          <w:szCs w:val="22"/>
+          <w:lang w:val="nl-NL"/>
+        </w:rPr>
+        <w:t xml:space="preserve"> Er komt een technocratische blik op het </w:t>
+      </w:r>
+      <w:r>
+        <w:rPr>
+          <w:rFonts w:ascii="Courier New" w:hAnsi="Courier New" w:cs="Courier New"/>
+          <w:sz w:val="22"/>
+          <w:szCs w:val="22"/>
+          <w:lang w:val="nl-NL"/>
+        </w:rPr>
+        <w:t>belasting</w:t>
+      </w:r>
+      <w:r>
+        <w:rPr>
+          <w:rFonts w:ascii="Courier New" w:hAnsi="Courier New" w:cs="Courier New"/>
+          <w:sz w:val="22"/>
+          <w:szCs w:val="22"/>
+          <w:lang w:val="nl-NL"/>
+        </w:rPr>
+        <w:t>systeem en dat is een blik van binnenuit</w:t>
+      </w:r>
+      <w:r>
+        <w:rPr>
+          <w:rFonts w:ascii="Courier New" w:hAnsi="Courier New" w:cs="Courier New"/>
+          <w:sz w:val="22"/>
+          <w:szCs w:val="22"/>
+          <w:lang w:val="nl-NL"/>
+        </w:rPr>
+        <w:t>. Er wordt in ieder geval</w:t>
+      </w:r>
+      <w:r>
+        <w:rPr>
+          <w:rFonts w:ascii="Courier New" w:hAnsi="Courier New" w:cs="Courier New"/>
+          <w:sz w:val="22"/>
+          <w:szCs w:val="22"/>
+          <w:lang w:val="nl-NL"/>
+        </w:rPr>
+        <w:t xml:space="preserve"> niet meer </w:t>
+      </w:r>
+      <w:r>
+        <w:rPr>
+          <w:rFonts w:ascii="Courier New" w:hAnsi="Courier New" w:cs="Courier New"/>
+          <w:sz w:val="22"/>
+          <w:szCs w:val="22"/>
+          <w:lang w:val="nl-NL"/>
+        </w:rPr>
+        <w:t>nagedacht</w:t>
+      </w:r>
+      <w:r>
+        <w:rPr>
+          <w:rFonts w:ascii="Courier New" w:hAnsi="Courier New" w:cs="Courier New"/>
+          <w:sz w:val="22"/>
+          <w:szCs w:val="22"/>
+          <w:lang w:val="nl-NL"/>
+        </w:rPr>
+        <w:t xml:space="preserve"> over de democratische legitimatie van het systeem. Het gaat </w:t>
+      </w:r>
+      <w:r>
+        <w:rPr>
+          <w:rFonts w:ascii="Courier New" w:hAnsi="Courier New" w:cs="Courier New"/>
+          <w:sz w:val="22"/>
+          <w:szCs w:val="22"/>
+          <w:lang w:val="nl-NL"/>
+        </w:rPr>
+        <w:t xml:space="preserve">nu </w:t>
+      </w:r>
+      <w:r>
+        <w:rPr>
+          <w:rFonts w:ascii="Courier New" w:hAnsi="Courier New" w:cs="Courier New"/>
+          <w:sz w:val="22"/>
+          <w:szCs w:val="22"/>
+          <w:lang w:val="nl-NL"/>
+        </w:rPr>
+        <w:t>om wetten en regels en niet meer om de principes.</w:t>
       </w:r>
     </w:p>
     <w:p>
@@ -1865,39 +2223,266 @@
           <w:szCs w:val="22"/>
           <w:lang w:val="nl-NL"/>
         </w:rPr>
-        <w:t>De principes</w:t>
-      </w:r>
-      <w:r>
-        <w:rPr>
-          <w:rFonts w:ascii="Courier New" w:hAnsi="Courier New" w:cs="Courier New"/>
-          <w:sz w:val="22"/>
-          <w:szCs w:val="22"/>
-          <w:lang w:val="nl-NL"/>
-        </w:rPr>
-        <w:t xml:space="preserve"> en waar het nu op is gebaseerd</w:t>
-      </w:r>
-      <w:r>
-        <w:rPr>
-          <w:rFonts w:ascii="Courier New" w:hAnsi="Courier New" w:cs="Courier New"/>
-          <w:sz w:val="22"/>
-          <w:szCs w:val="22"/>
-          <w:lang w:val="nl-NL"/>
-        </w:rPr>
-        <w:t>. Het zijn niet meer de juristen die aan de basis staan van het belastingstelsel, maar het zijn nu de economen.</w:t>
-      </w:r>
-      <w:r>
-        <w:rPr>
-          <w:rFonts w:ascii="Courier New" w:hAnsi="Courier New" w:cs="Courier New"/>
-          <w:sz w:val="22"/>
-          <w:szCs w:val="22"/>
-          <w:lang w:val="nl-NL"/>
-        </w:rPr>
-        <w:t xml:space="preserve"> Er komt een technocratische blik op het systeem en dat is een blik van binnenuit die niet meer kan nadenken over de democratische legitimatie van het systeem. Het gaat om wetten en regels en niets meer om de principes.</w:t>
+        <w:tab/>
+        <w:t xml:space="preserve">In de twintigste eeuw </w:t>
+      </w:r>
+      <w:r>
+        <w:rPr>
+          <w:rFonts w:ascii="Courier New" w:hAnsi="Courier New" w:cs="Courier New"/>
+          <w:sz w:val="22"/>
+          <w:szCs w:val="22"/>
+          <w:lang w:val="nl-NL"/>
+        </w:rPr>
+        <w:t>vond er</w:t>
+      </w:r>
+      <w:r>
+        <w:rPr>
+          <w:rFonts w:ascii="Courier New" w:hAnsi="Courier New" w:cs="Courier New"/>
+          <w:sz w:val="22"/>
+          <w:szCs w:val="22"/>
+          <w:lang w:val="nl-NL"/>
+        </w:rPr>
+        <w:t xml:space="preserve"> een enorme schaalvergroting plaatsg en zijn de belastingsystemen overal behoorlijk op elkaar gaan lijken. De tarieven staan vast en de opbrengsten zijn variabel, afhankelijk van economische en demografische veranderingen. Ook de omvang </w:t>
+      </w:r>
+      <w:r>
+        <w:rPr>
+          <w:rFonts w:ascii="Courier New" w:hAnsi="Courier New" w:cs="Courier New"/>
+          <w:sz w:val="22"/>
+          <w:szCs w:val="22"/>
+          <w:lang w:val="nl-NL"/>
+        </w:rPr>
+        <w:t>van belasting nam</w:t>
+      </w:r>
+      <w:r>
+        <w:rPr>
+          <w:rFonts w:ascii="Courier New" w:hAnsi="Courier New" w:cs="Courier New"/>
+          <w:sz w:val="22"/>
+          <w:szCs w:val="22"/>
+          <w:lang w:val="nl-NL"/>
+        </w:rPr>
+        <w:t xml:space="preserve"> sterk toe </w:t>
+      </w:r>
+      <w:r>
+        <w:rPr>
+          <w:rFonts w:ascii="Courier New" w:hAnsi="Courier New" w:cs="Courier New"/>
+          <w:sz w:val="22"/>
+          <w:szCs w:val="22"/>
+          <w:lang w:val="nl-NL"/>
+        </w:rPr>
+        <w:t>omdat</w:t>
+      </w:r>
+      <w:r>
+        <w:rPr>
+          <w:rFonts w:ascii="Courier New" w:hAnsi="Courier New" w:cs="Courier New"/>
+          <w:sz w:val="22"/>
+          <w:szCs w:val="22"/>
+          <w:lang w:val="nl-NL"/>
+        </w:rPr>
+        <w:t xml:space="preserve"> veel van </w:t>
+      </w:r>
+      <w:r>
+        <w:rPr>
+          <w:rFonts w:ascii="Courier New" w:hAnsi="Courier New" w:cs="Courier New"/>
+          <w:sz w:val="22"/>
+          <w:szCs w:val="22"/>
+          <w:lang w:val="nl-NL"/>
+        </w:rPr>
+        <w:t xml:space="preserve">de </w:t>
+      </w:r>
+      <w:r>
+        <w:rPr>
+          <w:rFonts w:ascii="Courier New" w:hAnsi="Courier New" w:cs="Courier New"/>
+          <w:sz w:val="22"/>
+          <w:szCs w:val="22"/>
+          <w:lang w:val="nl-NL"/>
+        </w:rPr>
+        <w:t>priva</w:t>
+      </w:r>
+      <w:r>
+        <w:rPr>
+          <w:rFonts w:ascii="Courier New" w:hAnsi="Courier New" w:cs="Courier New"/>
+          <w:sz w:val="22"/>
+          <w:szCs w:val="22"/>
+          <w:lang w:val="nl-NL"/>
+        </w:rPr>
+        <w:t>te</w:t>
+      </w:r>
+      <w:r>
+        <w:rPr>
+          <w:rFonts w:ascii="Courier New" w:hAnsi="Courier New" w:cs="Courier New"/>
+          <w:sz w:val="22"/>
+          <w:szCs w:val="22"/>
+          <w:lang w:val="nl-NL"/>
+        </w:rPr>
+        <w:t xml:space="preserve"> naar </w:t>
+      </w:r>
+      <w:r>
+        <w:rPr>
+          <w:rFonts w:ascii="Courier New" w:hAnsi="Courier New" w:cs="Courier New"/>
+          <w:sz w:val="22"/>
+          <w:szCs w:val="22"/>
+          <w:lang w:val="nl-NL"/>
+        </w:rPr>
+        <w:t xml:space="preserve">de </w:t>
+      </w:r>
+      <w:r>
+        <w:rPr>
+          <w:rFonts w:ascii="Courier New" w:hAnsi="Courier New" w:cs="Courier New"/>
+          <w:sz w:val="22"/>
+          <w:szCs w:val="22"/>
+          <w:lang w:val="nl-NL"/>
+        </w:rPr>
+        <w:t xml:space="preserve">publieke sector </w:t>
+      </w:r>
+      <w:r>
+        <w:rPr>
+          <w:rFonts w:ascii="Courier New" w:hAnsi="Courier New" w:cs="Courier New"/>
+          <w:sz w:val="22"/>
+          <w:szCs w:val="22"/>
+          <w:lang w:val="nl-NL"/>
+        </w:rPr>
+        <w:t>wordt</w:t>
+      </w:r>
+      <w:r>
+        <w:rPr>
+          <w:rFonts w:ascii="Courier New" w:hAnsi="Courier New" w:cs="Courier New"/>
+          <w:sz w:val="22"/>
+          <w:szCs w:val="22"/>
+          <w:lang w:val="nl-NL"/>
+        </w:rPr>
+        <w:t xml:space="preserve"> overgeheveld.</w:t>
+      </w:r>
+      <w:r>
+        <w:rPr>
+          <w:rFonts w:ascii="Courier New" w:hAnsi="Courier New" w:cs="Courier New"/>
+          <w:sz w:val="22"/>
+          <w:szCs w:val="22"/>
+          <w:lang w:val="nl-NL"/>
+        </w:rPr>
+        <w:t xml:space="preserve"> De </w:t>
+      </w:r>
+      <w:r>
+        <w:rPr>
+          <w:rFonts w:ascii="Courier New" w:hAnsi="Courier New" w:cs="Courier New"/>
+          <w:sz w:val="22"/>
+          <w:szCs w:val="22"/>
+          <w:lang w:val="nl-NL"/>
+        </w:rPr>
+        <w:t xml:space="preserve">meeste </w:t>
+      </w:r>
+      <w:r>
+        <w:rPr>
+          <w:rFonts w:ascii="Courier New" w:hAnsi="Courier New" w:cs="Courier New"/>
+          <w:sz w:val="22"/>
+          <w:szCs w:val="22"/>
+          <w:lang w:val="nl-NL"/>
+        </w:rPr>
+        <w:t>belastingen w</w:t>
+      </w:r>
+      <w:r>
+        <w:rPr>
+          <w:rFonts w:ascii="Courier New" w:hAnsi="Courier New" w:cs="Courier New"/>
+          <w:sz w:val="22"/>
+          <w:szCs w:val="22"/>
+          <w:lang w:val="nl-NL"/>
+        </w:rPr>
+        <w:t>e</w:t>
+      </w:r>
+      <w:r>
+        <w:rPr>
+          <w:rFonts w:ascii="Courier New" w:hAnsi="Courier New" w:cs="Courier New"/>
+          <w:sz w:val="22"/>
+          <w:szCs w:val="22"/>
+          <w:lang w:val="nl-NL"/>
+        </w:rPr>
+        <w:t xml:space="preserve">rden vooral uit het inkomen gehaald aangevuld door indirecte belastingen uit consumpties en transacties. De vermogensbelasting </w:t>
+      </w:r>
+      <w:r>
+        <w:rPr>
+          <w:rFonts w:ascii="Courier New" w:hAnsi="Courier New" w:cs="Courier New"/>
+          <w:sz w:val="22"/>
+          <w:szCs w:val="22"/>
+          <w:lang w:val="nl-NL"/>
+        </w:rPr>
+        <w:t>was</w:t>
+      </w:r>
+      <w:r>
+        <w:rPr>
+          <w:rFonts w:ascii="Courier New" w:hAnsi="Courier New" w:cs="Courier New"/>
+          <w:sz w:val="22"/>
+          <w:szCs w:val="22"/>
+          <w:lang w:val="nl-NL"/>
+        </w:rPr>
+        <w:t xml:space="preserve"> daarmee vergeleken laag. </w:t>
+      </w:r>
+      <w:r>
+        <w:rPr>
+          <w:rFonts w:ascii="Courier New" w:hAnsi="Courier New" w:cs="Courier New"/>
+          <w:sz w:val="22"/>
+          <w:szCs w:val="22"/>
+          <w:lang w:val="nl-NL"/>
+        </w:rPr>
+        <w:t>Er kwam een grote</w:t>
+      </w:r>
+      <w:r>
+        <w:rPr>
+          <w:rFonts w:ascii="Courier New" w:hAnsi="Courier New" w:cs="Courier New"/>
+          <w:sz w:val="22"/>
+          <w:szCs w:val="22"/>
+          <w:lang w:val="nl-NL"/>
+        </w:rPr>
+        <w:t xml:space="preserve"> hoeveelheid belastingen </w:t>
+      </w:r>
+      <w:r>
+        <w:rPr>
+          <w:rFonts w:ascii="Courier New" w:hAnsi="Courier New" w:cs="Courier New"/>
+          <w:sz w:val="22"/>
+          <w:szCs w:val="22"/>
+          <w:lang w:val="nl-NL"/>
+        </w:rPr>
+        <w:t xml:space="preserve">waardoor </w:t>
+      </w:r>
+      <w:r>
+        <w:rPr>
+          <w:rFonts w:ascii="Courier New" w:hAnsi="Courier New" w:cs="Courier New"/>
+          <w:sz w:val="22"/>
+          <w:szCs w:val="22"/>
+          <w:lang w:val="nl-NL"/>
+        </w:rPr>
+        <w:t xml:space="preserve">het steeds moeilijker </w:t>
+      </w:r>
+      <w:r>
+        <w:rPr>
+          <w:rFonts w:ascii="Courier New" w:hAnsi="Courier New" w:cs="Courier New"/>
+          <w:sz w:val="22"/>
+          <w:szCs w:val="22"/>
+          <w:lang w:val="nl-NL"/>
+        </w:rPr>
+        <w:t xml:space="preserve">werd </w:t>
+      </w:r>
+      <w:r>
+        <w:rPr>
+          <w:rFonts w:ascii="Courier New" w:hAnsi="Courier New" w:cs="Courier New"/>
+          <w:sz w:val="22"/>
+          <w:szCs w:val="22"/>
+          <w:lang w:val="nl-NL"/>
+        </w:rPr>
+        <w:t>om te bepalen wie precies wat betaalt.</w:t>
+      </w:r>
+      <w:r>
+        <w:rPr>
+          <w:rFonts w:ascii="Courier New" w:hAnsi="Courier New" w:cs="Courier New"/>
+          <w:sz w:val="22"/>
+          <w:szCs w:val="22"/>
+          <w:lang w:val="nl-NL"/>
+        </w:rPr>
+        <w:t xml:space="preserve"> </w:t>
       </w:r>
     </w:p>
     <w:p>
       <w:pPr>
         <w:spacing w:line="360" w:lineRule="auto"/>
+        <w:ind w:firstLine="720"/>
         <w:rPr>
           <w:rFonts w:ascii="Courier New" w:hAnsi="Courier New" w:cs="Courier New"/>
           <w:sz w:val="22"/>
@@ -1912,17 +2497,196 @@
           <w:szCs w:val="22"/>
           <w:lang w:val="nl-NL"/>
         </w:rPr>
-        <w:tab/>
-        <w:t xml:space="preserve">In de twintigste eeuw heeft een enorme schaalvergroting plaatsgevonden en zijn de belastingsystemen overal behoorlijk op elkaar gaan lijken. De tarieven staan vast en de opbrengsten zijn variabel, afhankelijk van economische en demografische veranderingen. Ook de omvang is sterk toegenomen doordat veel van privaat naar publieke sector is overgeheveld. Om dat te financieren wordt er gebruik gemaakt van een grote hoeveelheid </w:t>
-      </w:r>
-      <w:r>
-        <w:rPr>
-          <w:rFonts w:ascii="Courier New" w:hAnsi="Courier New" w:cs="Courier New"/>
-          <w:sz w:val="22"/>
-          <w:szCs w:val="22"/>
-          <w:lang w:val="nl-NL"/>
-        </w:rPr>
-        <w:t>belastingen. De belastingen worden vooral uit het inkomen gehaald aangevuld door indirecte belastingen uit consumpties en transacties. De vermogensbelasting is daarmee vergeleken laag. Door de hoeveelheid belastingen is het steeds moeilijker om te bepalen wie precies wat betaalt. Maar het beperkte onderzoek dat er is voor Frankrijk, Nederland en de VS en waarin alle belastingen bij elkaar zijn opgeteld, maakt duidelijk dat de belastingdruk voor de laagste inkomsten nauwelijks verschilt van de rest van de bevolking en dat bij de hoogste inkomens de laagste belastingdruk wordt gemeten, een daling die in ons eigen land eerder inzet dan in Frankrijk en de VS. Dat alles maakt ook duidelijk dat indirecte belasting als btw en accijnzen veel zwaarder op de lagere inkomens dan op de hogere inkomens drukt. Van progressieve inkomstenbelasting blijft zo niet heel veel meer over. De laagste inkomsten hebben nauwelijks de mogelijkheid om kapitaal op te bouwen</w:t>
+        <w:t>En dit is nog steeds het geval.</w:t>
+      </w:r>
+      <w:r>
+        <w:rPr>
+          <w:rFonts w:ascii="Courier New" w:hAnsi="Courier New" w:cs="Courier New"/>
+          <w:sz w:val="22"/>
+          <w:szCs w:val="22"/>
+          <w:lang w:val="nl-NL"/>
+        </w:rPr>
+        <w:t xml:space="preserve"> </w:t>
+      </w:r>
+      <w:r>
+        <w:rPr>
+          <w:rFonts w:ascii="Courier New" w:hAnsi="Courier New" w:cs="Courier New"/>
+          <w:sz w:val="22"/>
+          <w:szCs w:val="22"/>
+          <w:lang w:val="nl-NL"/>
+        </w:rPr>
+        <w:t>H</w:t>
+      </w:r>
+      <w:r>
+        <w:rPr>
+          <w:rFonts w:ascii="Courier New" w:hAnsi="Courier New" w:cs="Courier New"/>
+          <w:sz w:val="22"/>
+          <w:szCs w:val="22"/>
+          <w:lang w:val="nl-NL"/>
+        </w:rPr>
+        <w:t xml:space="preserve">et beperkte onderzoek </w:t>
+      </w:r>
+      <w:r>
+        <w:rPr>
+          <w:rFonts w:ascii="Courier New" w:hAnsi="Courier New" w:cs="Courier New"/>
+          <w:sz w:val="22"/>
+          <w:szCs w:val="22"/>
+          <w:lang w:val="nl-NL"/>
+        </w:rPr>
+        <w:t xml:space="preserve">naar alle belastingen </w:t>
+      </w:r>
+      <w:r>
+        <w:rPr>
+          <w:rFonts w:ascii="Courier New" w:hAnsi="Courier New" w:cs="Courier New"/>
+          <w:sz w:val="22"/>
+          <w:szCs w:val="22"/>
+          <w:lang w:val="nl-NL"/>
+        </w:rPr>
+        <w:t xml:space="preserve">dat er </w:t>
+      </w:r>
+      <w:r>
+        <w:rPr>
+          <w:rFonts w:ascii="Courier New" w:hAnsi="Courier New" w:cs="Courier New"/>
+          <w:sz w:val="22"/>
+          <w:szCs w:val="22"/>
+          <w:lang w:val="nl-NL"/>
+        </w:rPr>
+        <w:t>opgeteld is, gaat over</w:t>
+      </w:r>
+      <w:r>
+        <w:rPr>
+          <w:rFonts w:ascii="Courier New" w:hAnsi="Courier New" w:cs="Courier New"/>
+          <w:sz w:val="22"/>
+          <w:szCs w:val="22"/>
+          <w:lang w:val="nl-NL"/>
+        </w:rPr>
+        <w:t xml:space="preserve"> Frankrijk, Nederland en de VS </w:t>
+      </w:r>
+      <w:r>
+        <w:rPr>
+          <w:rFonts w:ascii="Courier New" w:hAnsi="Courier New" w:cs="Courier New"/>
+          <w:sz w:val="22"/>
+          <w:szCs w:val="22"/>
+          <w:lang w:val="nl-NL"/>
+        </w:rPr>
+        <w:t>en</w:t>
+      </w:r>
+      <w:r>
+        <w:rPr>
+          <w:rFonts w:ascii="Courier New" w:hAnsi="Courier New" w:cs="Courier New"/>
+          <w:sz w:val="22"/>
+          <w:szCs w:val="22"/>
+          <w:lang w:val="nl-NL"/>
+        </w:rPr>
+        <w:t xml:space="preserve"> maakt duidelijk dat de belastingdruk voor de laagste inkomsten nauwelijks verschilt van de rest van de bevolking en dat bij de hoogste inkomens de laagste belastingdruk wordt gemeten</w:t>
+      </w:r>
+      <w:r>
+        <w:rPr>
+          <w:rFonts w:ascii="Courier New" w:hAnsi="Courier New" w:cs="Courier New"/>
+          <w:sz w:val="22"/>
+          <w:szCs w:val="22"/>
+          <w:lang w:val="nl-NL"/>
+        </w:rPr>
+        <w:t xml:space="preserve">. Een </w:t>
+      </w:r>
+      <w:r>
+        <w:rPr>
+          <w:rFonts w:ascii="Courier New" w:hAnsi="Courier New" w:cs="Courier New"/>
+          <w:sz w:val="22"/>
+          <w:szCs w:val="22"/>
+          <w:lang w:val="nl-NL"/>
+        </w:rPr>
+        <w:t xml:space="preserve">daling die in ons eigen land eerder </w:t>
+      </w:r>
+      <w:r>
+        <w:rPr>
+          <w:rFonts w:ascii="Courier New" w:hAnsi="Courier New" w:cs="Courier New"/>
+          <w:sz w:val="22"/>
+          <w:szCs w:val="22"/>
+          <w:lang w:val="nl-NL"/>
+        </w:rPr>
+        <w:t xml:space="preserve">nog eerder </w:t>
+      </w:r>
+      <w:r>
+        <w:rPr>
+          <w:rFonts w:ascii="Courier New" w:hAnsi="Courier New" w:cs="Courier New"/>
+          <w:sz w:val="22"/>
+          <w:szCs w:val="22"/>
+          <w:lang w:val="nl-NL"/>
+        </w:rPr>
+        <w:t>inzet dan in Frankrijk en de VS. D</w:t>
+      </w:r>
+      <w:r>
+        <w:rPr>
+          <w:rFonts w:ascii="Courier New" w:hAnsi="Courier New" w:cs="Courier New"/>
+          <w:sz w:val="22"/>
+          <w:szCs w:val="22"/>
+          <w:lang w:val="nl-NL"/>
+        </w:rPr>
+        <w:t>it soort onderzoek</w:t>
+      </w:r>
+      <w:r>
+        <w:rPr>
+          <w:rFonts w:ascii="Courier New" w:hAnsi="Courier New" w:cs="Courier New"/>
+          <w:sz w:val="22"/>
+          <w:szCs w:val="22"/>
+          <w:lang w:val="nl-NL"/>
+        </w:rPr>
+        <w:t xml:space="preserve"> maakt duidelijk dat indirecte belasting als btw en accijnzen veel zwaarder op de lagere inkomens </w:t>
+      </w:r>
+      <w:r>
+        <w:rPr>
+          <w:rFonts w:ascii="Courier New" w:hAnsi="Courier New" w:cs="Courier New"/>
+          <w:sz w:val="22"/>
+          <w:szCs w:val="22"/>
+          <w:lang w:val="nl-NL"/>
+        </w:rPr>
+        <w:t xml:space="preserve">drukt </w:t>
+      </w:r>
+      <w:r>
+        <w:rPr>
+          <w:rFonts w:ascii="Courier New" w:hAnsi="Courier New" w:cs="Courier New"/>
+          <w:sz w:val="22"/>
+          <w:szCs w:val="22"/>
+          <w:lang w:val="nl-NL"/>
+        </w:rPr>
+        <w:t>dan op de hogere inkomens</w:t>
+      </w:r>
+      <w:r>
+        <w:rPr>
+          <w:rFonts w:ascii="Courier New" w:hAnsi="Courier New" w:cs="Courier New"/>
+          <w:sz w:val="22"/>
+          <w:szCs w:val="22"/>
+          <w:lang w:val="nl-NL"/>
+        </w:rPr>
+        <w:t xml:space="preserve"> en van</w:t>
+      </w:r>
+      <w:r>
+        <w:rPr>
+          <w:rFonts w:ascii="Courier New" w:hAnsi="Courier New" w:cs="Courier New"/>
+          <w:sz w:val="22"/>
+          <w:szCs w:val="22"/>
+          <w:lang w:val="nl-NL"/>
+        </w:rPr>
+        <w:t xml:space="preserve"> progressieve inkomstenbelasting blijft </w:t>
+      </w:r>
+      <w:r>
+        <w:rPr>
+          <w:rFonts w:ascii="Courier New" w:hAnsi="Courier New" w:cs="Courier New"/>
+          <w:sz w:val="22"/>
+          <w:szCs w:val="22"/>
+          <w:lang w:val="nl-NL"/>
+        </w:rPr>
+        <w:t xml:space="preserve">er </w:t>
+      </w:r>
+      <w:r>
+        <w:rPr>
+          <w:rFonts w:ascii="Courier New" w:hAnsi="Courier New" w:cs="Courier New"/>
+          <w:sz w:val="22"/>
+          <w:szCs w:val="22"/>
+          <w:lang w:val="nl-NL"/>
+        </w:rPr>
+        <w:t>zo niet heel veel meer over. De laagste inkomsten hebben nauwelijks de mogelijkheid om kapitaal op te bouwen</w:t>
       </w:r>
       <w:r>
         <w:rPr>
@@ -1949,37 +2713,25 @@
           <w:szCs w:val="22"/>
           <w:lang w:val="nl-NL"/>
         </w:rPr>
-        <w:t xml:space="preserve">onder te brengen bij allerlei kapitaalvennootschappen waarmee ze minder belasting hoeven te betalen (belastingen die de laatste jaren in diverse landen ook nog </w:t>
-      </w:r>
-      <w:r>
-        <w:rPr>
-          <w:rFonts w:ascii="Courier New" w:hAnsi="Courier New" w:cs="Courier New"/>
-          <w:sz w:val="22"/>
-          <w:szCs w:val="22"/>
-          <w:lang w:val="nl-NL"/>
-        </w:rPr>
-        <w:lastRenderedPageBreak/>
-        <w:t xml:space="preserve">zijn verlaagd). In de meeste landen is de inkomstenverdeling veel gelijker dan de vermogensverdeling. Daar speelt ook nog de ondoorzichtigheid van </w:t>
-      </w:r>
-      <w:proofErr w:type="gramStart"/>
-      <w:r>
-        <w:rPr>
-          <w:rFonts w:ascii="Courier New" w:hAnsi="Courier New" w:cs="Courier New"/>
-          <w:sz w:val="22"/>
-          <w:szCs w:val="22"/>
-          <w:lang w:val="nl-NL"/>
-        </w:rPr>
-        <w:t>de belastingsysteem</w:t>
-      </w:r>
-      <w:proofErr w:type="gramEnd"/>
-      <w:r>
-        <w:rPr>
-          <w:rFonts w:ascii="Courier New" w:hAnsi="Courier New" w:cs="Courier New"/>
-          <w:sz w:val="22"/>
-          <w:szCs w:val="22"/>
-          <w:lang w:val="nl-NL"/>
-        </w:rPr>
-        <w:t xml:space="preserve"> (wie draagt hoeveel af) mee.</w:t>
+        <w:t xml:space="preserve">onder te brengen bij allerlei kapitaalvennootschappen waarmee ze minder belasting hoeven te betalen (belastingen die </w:t>
+      </w:r>
+      <w:r>
+        <w:rPr>
+          <w:rFonts w:ascii="Courier New" w:hAnsi="Courier New" w:cs="Courier New"/>
+          <w:sz w:val="22"/>
+          <w:szCs w:val="22"/>
+          <w:lang w:val="nl-NL"/>
+        </w:rPr>
+        <w:t xml:space="preserve">overigens </w:t>
+      </w:r>
+      <w:r>
+        <w:rPr>
+          <w:rFonts w:ascii="Courier New" w:hAnsi="Courier New" w:cs="Courier New"/>
+          <w:sz w:val="22"/>
+          <w:szCs w:val="22"/>
+          <w:lang w:val="nl-NL"/>
+        </w:rPr>
+        <w:t>de laatste jaren in diverse landen ook nog zijn verlaagd).</w:t>
       </w:r>
     </w:p>
     <w:p>
@@ -1992,54 +2744,6 @@
           <w:lang w:val="nl-NL"/>
         </w:rPr>
       </w:pPr>
-      <w:r>
-        <w:rPr>
-          <w:rFonts w:ascii="Courier New" w:hAnsi="Courier New" w:cs="Courier New"/>
-          <w:sz w:val="22"/>
-          <w:szCs w:val="22"/>
-          <w:lang w:val="nl-NL"/>
-        </w:rPr>
-        <w:tab/>
-        <w:t>Kooistra is op zoek naar een meer rechtvaardigere verdelingsnorm en daarbij draagt iedereen in de samenleving bij aan de publieke lasten naar omvang van zijn of haar financiële draagkracht. Dat principe is beter te bepalen aan de hand van het vermogen dan aan de hand van het inkomen. In het boek probeert hij uit te werken wat dat zou betekenen voor de Nederlandse situatie</w:t>
-      </w:r>
-      <w:r>
-        <w:rPr>
-          <w:rFonts w:ascii="Courier New" w:hAnsi="Courier New" w:cs="Courier New"/>
-          <w:sz w:val="22"/>
-          <w:szCs w:val="22"/>
-          <w:lang w:val="nl-NL"/>
-        </w:rPr>
-        <w:t xml:space="preserve">. Als dezelfde belastinginkomsten via vermogensbelastingen zouden worden geheven is iedereen verplicht om acht procent van zijn vermogen aan de staat af te dragen. Dan zou er één belasting zijn (vermogensbelasting) en de rest wordt afgeschaft. Kooistra is duidelijk, er zijn hele goede redenen om het huidige systeem af te schaffen en zeker als we naar het belastingsysteem kijken vanuit het perspectief van vrijheid en gelijkheid. Want het huidige systeem ontneemt grote groepen mensen om vermogen op te bouwen waar een kleiner groep alleen maar rijker wordt. Dat kan rustig worden </w:t>
-      </w:r>
-      <w:proofErr w:type="spellStart"/>
-      <w:r>
-        <w:rPr>
-          <w:rFonts w:ascii="Courier New" w:hAnsi="Courier New" w:cs="Courier New"/>
-          <w:sz w:val="22"/>
-          <w:szCs w:val="22"/>
-          <w:lang w:val="nl-NL"/>
-        </w:rPr>
-        <w:t>invoerd</w:t>
-      </w:r>
-      <w:proofErr w:type="spellEnd"/>
-      <w:r>
-        <w:rPr>
-          <w:rFonts w:ascii="Courier New" w:hAnsi="Courier New" w:cs="Courier New"/>
-          <w:sz w:val="22"/>
-          <w:szCs w:val="22"/>
-          <w:lang w:val="nl-NL"/>
-        </w:rPr>
-        <w:t>.</w:t>
-      </w:r>
-      <w:r>
-        <w:rPr>
-          <w:rFonts w:ascii="Courier New" w:hAnsi="Courier New" w:cs="Courier New"/>
-          <w:sz w:val="22"/>
-          <w:szCs w:val="22"/>
-          <w:lang w:val="nl-NL"/>
-        </w:rPr>
-        <w:t xml:space="preserve"> </w:t>
-      </w:r>
     </w:p>
     <w:p>
       <w:pPr>
@@ -2051,6 +2755,615 @@
           <w:lang w:val="nl-NL"/>
         </w:rPr>
       </w:pPr>
+    </w:p>
+    <w:p>
+      <w:pPr>
+        <w:spacing w:line="360" w:lineRule="auto"/>
+        <w:rPr>
+          <w:rFonts w:ascii="Courier New" w:hAnsi="Courier New" w:cs="Courier New"/>
+          <w:sz w:val="22"/>
+          <w:szCs w:val="22"/>
+          <w:lang w:val="nl-NL"/>
+        </w:rPr>
+      </w:pPr>
+      <w:r>
+        <w:rPr>
+          <w:rFonts w:ascii="Courier New" w:hAnsi="Courier New" w:cs="Courier New"/>
+          <w:sz w:val="22"/>
+          <w:szCs w:val="22"/>
+          <w:lang w:val="nl-NL"/>
+        </w:rPr>
+        <w:t xml:space="preserve">Kooistra is </w:t>
+      </w:r>
+      <w:r>
+        <w:rPr>
+          <w:rFonts w:ascii="Courier New" w:hAnsi="Courier New" w:cs="Courier New"/>
+          <w:sz w:val="22"/>
+          <w:szCs w:val="22"/>
+          <w:lang w:val="nl-NL"/>
+        </w:rPr>
+        <w:t xml:space="preserve">in zijn boek </w:t>
+      </w:r>
+      <w:r>
+        <w:rPr>
+          <w:rFonts w:ascii="Courier New" w:hAnsi="Courier New" w:cs="Courier New"/>
+          <w:sz w:val="22"/>
+          <w:szCs w:val="22"/>
+          <w:lang w:val="nl-NL"/>
+        </w:rPr>
+        <w:t xml:space="preserve">op zoek naar een meer rechtvaardigere verdelingsnorm </w:t>
+      </w:r>
+      <w:r>
+        <w:rPr>
+          <w:rFonts w:ascii="Courier New" w:hAnsi="Courier New" w:cs="Courier New"/>
+          <w:sz w:val="22"/>
+          <w:szCs w:val="22"/>
+          <w:lang w:val="nl-NL"/>
+        </w:rPr>
+        <w:t>voor belasting waarbij</w:t>
+      </w:r>
+      <w:r>
+        <w:rPr>
+          <w:rFonts w:ascii="Courier New" w:hAnsi="Courier New" w:cs="Courier New"/>
+          <w:sz w:val="22"/>
+          <w:szCs w:val="22"/>
+          <w:lang w:val="nl-NL"/>
+        </w:rPr>
+        <w:t xml:space="preserve"> iedereen in de samenleving bij</w:t>
+      </w:r>
+      <w:r>
+        <w:rPr>
+          <w:rFonts w:ascii="Courier New" w:hAnsi="Courier New" w:cs="Courier New"/>
+          <w:sz w:val="22"/>
+          <w:szCs w:val="22"/>
+          <w:lang w:val="nl-NL"/>
+        </w:rPr>
+        <w:t>draagt</w:t>
+      </w:r>
+      <w:r>
+        <w:rPr>
+          <w:rFonts w:ascii="Courier New" w:hAnsi="Courier New" w:cs="Courier New"/>
+          <w:sz w:val="22"/>
+          <w:szCs w:val="22"/>
+          <w:lang w:val="nl-NL"/>
+        </w:rPr>
+        <w:t xml:space="preserve"> aan de publieke lasten naar omvang van zijn of haar financiële draagkracht. Dat principe is beter te bepalen aan de hand van het vermogen </w:t>
+      </w:r>
+      <w:r>
+        <w:rPr>
+          <w:rFonts w:ascii="Courier New" w:hAnsi="Courier New" w:cs="Courier New"/>
+          <w:sz w:val="22"/>
+          <w:szCs w:val="22"/>
+          <w:lang w:val="nl-NL"/>
+        </w:rPr>
+        <w:t xml:space="preserve">van iemand </w:t>
+      </w:r>
+      <w:r>
+        <w:rPr>
+          <w:rFonts w:ascii="Courier New" w:hAnsi="Courier New" w:cs="Courier New"/>
+          <w:sz w:val="22"/>
+          <w:szCs w:val="22"/>
+          <w:lang w:val="nl-NL"/>
+        </w:rPr>
+        <w:t xml:space="preserve">dan aan de hand van </w:t>
+      </w:r>
+      <w:r>
+        <w:rPr>
+          <w:rFonts w:ascii="Courier New" w:hAnsi="Courier New" w:cs="Courier New"/>
+          <w:sz w:val="22"/>
+          <w:szCs w:val="22"/>
+          <w:lang w:val="nl-NL"/>
+        </w:rPr>
+        <w:t>zijn</w:t>
+      </w:r>
+      <w:r>
+        <w:rPr>
+          <w:rFonts w:ascii="Courier New" w:hAnsi="Courier New" w:cs="Courier New"/>
+          <w:sz w:val="22"/>
+          <w:szCs w:val="22"/>
+          <w:lang w:val="nl-NL"/>
+        </w:rPr>
+        <w:t xml:space="preserve"> inkomen. In het boek probeert hij </w:t>
+      </w:r>
+      <w:r>
+        <w:rPr>
+          <w:rFonts w:ascii="Courier New" w:hAnsi="Courier New" w:cs="Courier New"/>
+          <w:sz w:val="22"/>
+          <w:szCs w:val="22"/>
+          <w:lang w:val="nl-NL"/>
+        </w:rPr>
+        <w:t xml:space="preserve">dit voorstel concreet </w:t>
+      </w:r>
+      <w:r>
+        <w:rPr>
+          <w:rFonts w:ascii="Courier New" w:hAnsi="Courier New" w:cs="Courier New"/>
+          <w:sz w:val="22"/>
+          <w:szCs w:val="22"/>
+          <w:lang w:val="nl-NL"/>
+        </w:rPr>
+        <w:t xml:space="preserve">uit te werken </w:t>
+      </w:r>
+      <w:r>
+        <w:rPr>
+          <w:rFonts w:ascii="Courier New" w:hAnsi="Courier New" w:cs="Courier New"/>
+          <w:sz w:val="22"/>
+          <w:szCs w:val="22"/>
+          <w:lang w:val="nl-NL"/>
+        </w:rPr>
+        <w:t xml:space="preserve">en vraagt hij zich af </w:t>
+      </w:r>
+      <w:r>
+        <w:rPr>
+          <w:rFonts w:ascii="Courier New" w:hAnsi="Courier New" w:cs="Courier New"/>
+          <w:sz w:val="22"/>
+          <w:szCs w:val="22"/>
+          <w:lang w:val="nl-NL"/>
+        </w:rPr>
+        <w:t>wat dat zou betekenen voor de Nederlandse situatie</w:t>
+      </w:r>
+      <w:r>
+        <w:rPr>
+          <w:rFonts w:ascii="Courier New" w:hAnsi="Courier New" w:cs="Courier New"/>
+          <w:sz w:val="22"/>
+          <w:szCs w:val="22"/>
+          <w:lang w:val="nl-NL"/>
+        </w:rPr>
+        <w:t xml:space="preserve">. Als dezelfde belastinginkomsten via vermogensbelastingen zouden worden geheven is iedereen verplicht om acht procent van zijn vermogen aan de staat af te dragen. Dan zou er één belasting zijn (vermogensbelasting) en </w:t>
+      </w:r>
+      <w:r>
+        <w:rPr>
+          <w:rFonts w:ascii="Courier New" w:hAnsi="Courier New" w:cs="Courier New"/>
+          <w:sz w:val="22"/>
+          <w:szCs w:val="22"/>
+          <w:lang w:val="nl-NL"/>
+        </w:rPr>
+        <w:t xml:space="preserve">kan </w:t>
+      </w:r>
+      <w:r>
+        <w:rPr>
+          <w:rFonts w:ascii="Courier New" w:hAnsi="Courier New" w:cs="Courier New"/>
+          <w:sz w:val="22"/>
+          <w:szCs w:val="22"/>
+          <w:lang w:val="nl-NL"/>
+        </w:rPr>
+        <w:t>de rest word</w:t>
+      </w:r>
+      <w:r>
+        <w:rPr>
+          <w:rFonts w:ascii="Courier New" w:hAnsi="Courier New" w:cs="Courier New"/>
+          <w:sz w:val="22"/>
+          <w:szCs w:val="22"/>
+          <w:lang w:val="nl-NL"/>
+        </w:rPr>
+        <w:t>en</w:t>
+      </w:r>
+      <w:r>
+        <w:rPr>
+          <w:rFonts w:ascii="Courier New" w:hAnsi="Courier New" w:cs="Courier New"/>
+          <w:sz w:val="22"/>
+          <w:szCs w:val="22"/>
+          <w:lang w:val="nl-NL"/>
+        </w:rPr>
+        <w:t xml:space="preserve"> afgeschaft. Kooistra is duidelijk, er zijn hele goede redenen om het huidige systeem af te schaffen en zeker als we naar het belastingsysteem kijken vanuit het perspectief van vrijheid en gelijkheid. </w:t>
+      </w:r>
+      <w:r>
+        <w:rPr>
+          <w:rFonts w:ascii="Courier New" w:hAnsi="Courier New" w:cs="Courier New"/>
+          <w:sz w:val="22"/>
+          <w:szCs w:val="22"/>
+          <w:lang w:val="nl-NL"/>
+        </w:rPr>
+        <w:t>Het armste deel van de bevolking in West-Europa bezit slechts 4 procent van het vermogen en de rijkste helft bezig 96 procent. H</w:t>
+      </w:r>
+      <w:r>
+        <w:rPr>
+          <w:rFonts w:ascii="Courier New" w:hAnsi="Courier New" w:cs="Courier New"/>
+          <w:sz w:val="22"/>
+          <w:szCs w:val="22"/>
+          <w:lang w:val="nl-NL"/>
+        </w:rPr>
+        <w:t>et huidige systeem ontneemt grote groepen mensen om vermogen op te bouwen</w:t>
+      </w:r>
+      <w:r>
+        <w:rPr>
+          <w:rFonts w:ascii="Courier New" w:hAnsi="Courier New" w:cs="Courier New"/>
+          <w:sz w:val="22"/>
+          <w:szCs w:val="22"/>
+          <w:lang w:val="nl-NL"/>
+        </w:rPr>
+        <w:t>,</w:t>
+      </w:r>
+      <w:r>
+        <w:rPr>
+          <w:rFonts w:ascii="Courier New" w:hAnsi="Courier New" w:cs="Courier New"/>
+          <w:sz w:val="22"/>
+          <w:szCs w:val="22"/>
+          <w:lang w:val="nl-NL"/>
+        </w:rPr>
+        <w:t xml:space="preserve"> waar een kleiner groep alleen maar rijker wordt</w:t>
+      </w:r>
+      <w:r>
+        <w:rPr>
+          <w:rFonts w:ascii="Courier New" w:hAnsi="Courier New" w:cs="Courier New"/>
+          <w:sz w:val="22"/>
+          <w:szCs w:val="22"/>
+          <w:lang w:val="nl-NL"/>
+        </w:rPr>
+        <w:t xml:space="preserve">. </w:t>
+      </w:r>
+      <w:r>
+        <w:rPr>
+          <w:rFonts w:ascii="Courier New" w:hAnsi="Courier New" w:cs="Courier New"/>
+          <w:sz w:val="22"/>
+          <w:szCs w:val="22"/>
+          <w:lang w:val="nl-NL"/>
+        </w:rPr>
+        <w:t xml:space="preserve">Kooiman weet ook dat het goed is om zo’n voorstel heel </w:t>
+      </w:r>
+      <w:r>
+        <w:rPr>
+          <w:rFonts w:ascii="Courier New" w:hAnsi="Courier New" w:cs="Courier New"/>
+          <w:sz w:val="22"/>
+          <w:szCs w:val="22"/>
+          <w:lang w:val="nl-NL"/>
+        </w:rPr>
+        <w:t xml:space="preserve">rustig </w:t>
+      </w:r>
+      <w:r>
+        <w:rPr>
+          <w:rFonts w:ascii="Courier New" w:hAnsi="Courier New" w:cs="Courier New"/>
+          <w:sz w:val="22"/>
+          <w:szCs w:val="22"/>
+          <w:lang w:val="nl-NL"/>
+        </w:rPr>
+        <w:t xml:space="preserve">in te voeren en voor dat nieuwe systeem de tijd te </w:t>
+      </w:r>
+      <w:proofErr w:type="spellStart"/>
+      <w:proofErr w:type="gramStart"/>
+      <w:r>
+        <w:rPr>
+          <w:rFonts w:ascii="Courier New" w:hAnsi="Courier New" w:cs="Courier New"/>
+          <w:sz w:val="22"/>
+          <w:szCs w:val="22"/>
+          <w:lang w:val="nl-NL"/>
+        </w:rPr>
+        <w:t>nemen.Bijvoorbeeld</w:t>
+      </w:r>
+      <w:proofErr w:type="spellEnd"/>
+      <w:proofErr w:type="gramEnd"/>
+      <w:r>
+        <w:rPr>
+          <w:rFonts w:ascii="Courier New" w:hAnsi="Courier New" w:cs="Courier New"/>
+          <w:sz w:val="22"/>
+          <w:szCs w:val="22"/>
+          <w:lang w:val="nl-NL"/>
+        </w:rPr>
+        <w:t xml:space="preserve"> door te beginnen met 1 procent belasting op het vermogen te rekenen en daarmee andere belastingen langzaam te kunnen afbouwen, bijvoorbeeld die op het arbeidsinkomen te verminderen zodat meer mensen vermogen kunnen opbouwen. </w:t>
+      </w:r>
+    </w:p>
+    <w:p>
+      <w:pPr>
+        <w:spacing w:line="360" w:lineRule="auto"/>
+        <w:rPr>
+          <w:rFonts w:ascii="Courier New" w:hAnsi="Courier New" w:cs="Courier New"/>
+          <w:sz w:val="22"/>
+          <w:szCs w:val="22"/>
+          <w:lang w:val="nl-NL"/>
+        </w:rPr>
+      </w:pPr>
+      <w:r>
+        <w:rPr>
+          <w:rFonts w:ascii="Courier New" w:hAnsi="Courier New" w:cs="Courier New"/>
+          <w:sz w:val="22"/>
+          <w:szCs w:val="22"/>
+          <w:lang w:val="nl-NL"/>
+        </w:rPr>
+        <w:tab/>
+        <w:t xml:space="preserve">Dit komt weer overheen met </w:t>
+      </w:r>
+      <w:r>
+        <w:rPr>
+          <w:rFonts w:ascii="Courier New" w:hAnsi="Courier New" w:cs="Courier New"/>
+          <w:sz w:val="22"/>
+          <w:szCs w:val="22"/>
+          <w:lang w:val="nl-NL"/>
+        </w:rPr>
+        <w:t xml:space="preserve">de </w:t>
+      </w:r>
+      <w:proofErr w:type="spellStart"/>
+      <w:r>
+        <w:rPr>
+          <w:rFonts w:ascii="Courier New" w:hAnsi="Courier New" w:cs="Courier New"/>
+          <w:sz w:val="22"/>
+          <w:szCs w:val="22"/>
+          <w:lang w:val="nl-NL"/>
+        </w:rPr>
+        <w:t>ideeên</w:t>
+      </w:r>
+      <w:proofErr w:type="spellEnd"/>
+      <w:r>
+        <w:rPr>
+          <w:rFonts w:ascii="Courier New" w:hAnsi="Courier New" w:cs="Courier New"/>
+          <w:sz w:val="22"/>
+          <w:szCs w:val="22"/>
+          <w:lang w:val="nl-NL"/>
+        </w:rPr>
+        <w:t xml:space="preserve"> van Gabriel </w:t>
+      </w:r>
+      <w:proofErr w:type="spellStart"/>
+      <w:r>
+        <w:rPr>
+          <w:rFonts w:ascii="Courier New" w:hAnsi="Courier New" w:cs="Courier New"/>
+          <w:sz w:val="22"/>
+          <w:szCs w:val="22"/>
+          <w:lang w:val="nl-NL"/>
+        </w:rPr>
+        <w:t>Zucman</w:t>
+      </w:r>
+      <w:proofErr w:type="spellEnd"/>
+      <w:r>
+        <w:rPr>
+          <w:rFonts w:ascii="Courier New" w:hAnsi="Courier New" w:cs="Courier New"/>
+          <w:sz w:val="22"/>
+          <w:szCs w:val="22"/>
+          <w:lang w:val="nl-NL"/>
+        </w:rPr>
+        <w:t xml:space="preserve"> die in </w:t>
+      </w:r>
+      <w:r>
+        <w:rPr>
+          <w:rFonts w:ascii="Courier New" w:hAnsi="Courier New" w:cs="Courier New"/>
+          <w:i/>
+          <w:iCs/>
+          <w:sz w:val="22"/>
+          <w:szCs w:val="22"/>
+          <w:lang w:val="nl-NL"/>
+        </w:rPr>
+        <w:t>Miljardairs betalen geen inkomstenbelasting en daar gaan we een einde aan maken</w:t>
+      </w:r>
+      <w:r>
+        <w:rPr>
+          <w:rFonts w:ascii="Courier New" w:hAnsi="Courier New" w:cs="Courier New"/>
+          <w:sz w:val="22"/>
+          <w:szCs w:val="22"/>
+          <w:lang w:val="nl-NL"/>
+        </w:rPr>
+        <w:t xml:space="preserve"> voorstel om superrijken (zij met een vermogen van 100 miljoen</w:t>
+      </w:r>
+      <w:r>
+        <w:rPr>
+          <w:rFonts w:ascii="Courier New" w:hAnsi="Courier New" w:cs="Courier New"/>
+          <w:sz w:val="22"/>
+          <w:szCs w:val="22"/>
+          <w:lang w:val="nl-NL"/>
+        </w:rPr>
+        <w:t xml:space="preserve"> euro) 2 procent vermogensbelasting te laten betalen. </w:t>
+      </w:r>
+      <w:r>
+        <w:rPr>
+          <w:rFonts w:ascii="Courier New" w:hAnsi="Courier New" w:cs="Courier New"/>
+          <w:sz w:val="22"/>
+          <w:szCs w:val="22"/>
+          <w:lang w:val="nl-NL"/>
+        </w:rPr>
+        <w:t>De machtigste mensen in de samenleving dragen nu niet naar draagkracht bij en dat is een schending van de fundamentele principes van rechtvaardigheid. Alle sociale klassen betalen ongeveer de helft van hun inkomen aan belasting, behalve de miljardairs die zo’n 13% betalen</w:t>
+      </w:r>
+      <w:r>
+        <w:rPr>
+          <w:rFonts w:ascii="Courier New" w:hAnsi="Courier New" w:cs="Courier New"/>
+          <w:sz w:val="22"/>
+          <w:szCs w:val="22"/>
+          <w:lang w:val="nl-NL"/>
+        </w:rPr>
+        <w:t xml:space="preserve">. Zij halen vooral hun rijkdom uit de bedrijven die ze bezitten. De meeste mensen geven het grootste deel van hun inkomen aan belasting uit en voor de superrijken geldt het tegenovergestelde. En zo is de wereld een belastingparadijs voor miljardairs geworden waar </w:t>
+      </w:r>
+      <w:proofErr w:type="spellStart"/>
+      <w:r>
+        <w:rPr>
+          <w:rFonts w:ascii="Courier New" w:hAnsi="Courier New" w:cs="Courier New"/>
+          <w:sz w:val="22"/>
+          <w:szCs w:val="22"/>
+          <w:lang w:val="nl-NL"/>
+        </w:rPr>
+        <w:t>Zucman</w:t>
+      </w:r>
+      <w:proofErr w:type="spellEnd"/>
+      <w:r>
+        <w:rPr>
+          <w:rFonts w:ascii="Courier New" w:hAnsi="Courier New" w:cs="Courier New"/>
+          <w:sz w:val="22"/>
+          <w:szCs w:val="22"/>
+          <w:lang w:val="nl-NL"/>
+        </w:rPr>
+        <w:t xml:space="preserve"> een einde aan wil maken.</w:t>
+      </w:r>
+    </w:p>
+    <w:p>
+      <w:pPr>
+        <w:spacing w:line="360" w:lineRule="auto"/>
+        <w:rPr>
+          <w:rFonts w:ascii="Courier New" w:hAnsi="Courier New" w:cs="Courier New"/>
+          <w:sz w:val="22"/>
+          <w:szCs w:val="22"/>
+          <w:lang w:val="nl-NL"/>
+        </w:rPr>
+      </w:pPr>
+      <w:r>
+        <w:rPr>
+          <w:rFonts w:ascii="Courier New" w:hAnsi="Courier New" w:cs="Courier New"/>
+          <w:sz w:val="22"/>
+          <w:szCs w:val="22"/>
+          <w:lang w:val="nl-NL"/>
+        </w:rPr>
+        <w:lastRenderedPageBreak/>
+        <w:t xml:space="preserve"> </w:t>
+      </w:r>
+      <w:r>
+        <w:rPr>
+          <w:rFonts w:ascii="Courier New" w:hAnsi="Courier New" w:cs="Courier New"/>
+          <w:sz w:val="22"/>
+          <w:szCs w:val="22"/>
+          <w:lang w:val="nl-NL"/>
+        </w:rPr>
+        <w:t xml:space="preserve"> </w:t>
+      </w:r>
+      <w:r>
+        <w:rPr>
+          <w:rFonts w:ascii="Courier New" w:hAnsi="Courier New" w:cs="Courier New"/>
+          <w:sz w:val="22"/>
+          <w:szCs w:val="22"/>
+          <w:lang w:val="nl-NL"/>
+        </w:rPr>
+        <w:t>Kooiman stelt in zijn boek de korte en terechte vraag: v</w:t>
+      </w:r>
+      <w:r>
+        <w:rPr>
+          <w:rFonts w:ascii="Courier New" w:hAnsi="Courier New" w:cs="Courier New"/>
+          <w:sz w:val="22"/>
+          <w:szCs w:val="22"/>
+          <w:lang w:val="nl-NL"/>
+        </w:rPr>
+        <w:t>an wie is de wereld?</w:t>
+      </w:r>
+      <w:r>
+        <w:rPr>
+          <w:rFonts w:ascii="Courier New" w:hAnsi="Courier New" w:cs="Courier New"/>
+          <w:sz w:val="22"/>
+          <w:szCs w:val="22"/>
+          <w:lang w:val="nl-NL"/>
+        </w:rPr>
+        <w:t xml:space="preserve"> Hij laat zien dat in</w:t>
+      </w:r>
+      <w:r>
+        <w:rPr>
+          <w:rFonts w:ascii="Courier New" w:hAnsi="Courier New" w:cs="Courier New"/>
+          <w:sz w:val="22"/>
+          <w:szCs w:val="22"/>
+          <w:lang w:val="nl-NL"/>
+        </w:rPr>
+        <w:t xml:space="preserve"> de geschiedenis </w:t>
+      </w:r>
+      <w:r>
+        <w:rPr>
+          <w:rFonts w:ascii="Courier New" w:hAnsi="Courier New" w:cs="Courier New"/>
+          <w:sz w:val="22"/>
+          <w:szCs w:val="22"/>
+          <w:lang w:val="nl-NL"/>
+        </w:rPr>
+        <w:t>van belastingen (waarop hij in het eerste deel van het boek soms net iets te lang door</w:t>
+      </w:r>
+      <w:r>
+        <w:rPr>
+          <w:rFonts w:ascii="Courier New" w:hAnsi="Courier New" w:cs="Courier New"/>
+          <w:sz w:val="22"/>
+          <w:szCs w:val="22"/>
+          <w:lang w:val="nl-NL"/>
+        </w:rPr>
+        <w:t>loopt</w:t>
+      </w:r>
+      <w:r>
+        <w:rPr>
+          <w:rFonts w:ascii="Courier New" w:hAnsi="Courier New" w:cs="Courier New"/>
+          <w:sz w:val="22"/>
+          <w:szCs w:val="22"/>
+          <w:lang w:val="nl-NL"/>
+        </w:rPr>
+        <w:t>)</w:t>
+      </w:r>
+      <w:r>
+        <w:rPr>
+          <w:rFonts w:ascii="Courier New" w:hAnsi="Courier New" w:cs="Courier New"/>
+          <w:sz w:val="22"/>
+          <w:szCs w:val="22"/>
+          <w:lang w:val="nl-NL"/>
+        </w:rPr>
+        <w:t xml:space="preserve"> </w:t>
+      </w:r>
+      <w:r>
+        <w:rPr>
+          <w:rFonts w:ascii="Courier New" w:hAnsi="Courier New" w:cs="Courier New"/>
+          <w:sz w:val="22"/>
+          <w:szCs w:val="22"/>
+          <w:lang w:val="nl-NL"/>
+        </w:rPr>
+        <w:t>er maar</w:t>
+      </w:r>
+      <w:r>
+        <w:rPr>
+          <w:rFonts w:ascii="Courier New" w:hAnsi="Courier New" w:cs="Courier New"/>
+          <w:sz w:val="22"/>
+          <w:szCs w:val="22"/>
+          <w:lang w:val="nl-NL"/>
+        </w:rPr>
+        <w:t xml:space="preserve"> een hele dunne draad van rechtvaardigheid</w:t>
+      </w:r>
+      <w:r>
+        <w:rPr>
+          <w:rFonts w:ascii="Courier New" w:hAnsi="Courier New" w:cs="Courier New"/>
+          <w:sz w:val="22"/>
+          <w:szCs w:val="22"/>
+          <w:lang w:val="nl-NL"/>
+        </w:rPr>
+        <w:t xml:space="preserve"> loopt</w:t>
+      </w:r>
+      <w:r>
+        <w:rPr>
+          <w:rFonts w:ascii="Courier New" w:hAnsi="Courier New" w:cs="Courier New"/>
+          <w:sz w:val="22"/>
+          <w:szCs w:val="22"/>
+          <w:lang w:val="nl-NL"/>
+        </w:rPr>
+        <w:t>.</w:t>
+      </w:r>
+      <w:r>
+        <w:rPr>
+          <w:rFonts w:ascii="Courier New" w:hAnsi="Courier New" w:cs="Courier New"/>
+          <w:sz w:val="22"/>
+          <w:szCs w:val="22"/>
+          <w:lang w:val="nl-NL"/>
+        </w:rPr>
+        <w:t xml:space="preserve"> Daar is sprake van in een bepaalde periode in de Italiaanse stadsstaten, bij het werk van enkele Middeleeuwse juristen en in de periode na de Tweede Wereldoorlog waarin er meer gelijkheid kwam. Het onderwerp is terug op de agenda via mensen als </w:t>
+      </w:r>
+      <w:proofErr w:type="spellStart"/>
+      <w:r>
+        <w:rPr>
+          <w:rFonts w:ascii="Courier New" w:hAnsi="Courier New" w:cs="Courier New"/>
+          <w:sz w:val="22"/>
+          <w:szCs w:val="22"/>
+          <w:lang w:val="nl-NL"/>
+        </w:rPr>
+        <w:t>Piketty</w:t>
+      </w:r>
+      <w:proofErr w:type="spellEnd"/>
+      <w:r>
+        <w:rPr>
+          <w:rFonts w:ascii="Courier New" w:hAnsi="Courier New" w:cs="Courier New"/>
+          <w:sz w:val="22"/>
+          <w:szCs w:val="22"/>
+          <w:lang w:val="nl-NL"/>
+        </w:rPr>
+        <w:t xml:space="preserve">, </w:t>
+      </w:r>
+      <w:proofErr w:type="spellStart"/>
+      <w:r>
+        <w:rPr>
+          <w:rFonts w:ascii="Courier New" w:hAnsi="Courier New" w:cs="Courier New"/>
+          <w:sz w:val="22"/>
+          <w:szCs w:val="22"/>
+          <w:lang w:val="nl-NL"/>
+        </w:rPr>
+        <w:t>Zucman</w:t>
+      </w:r>
+      <w:proofErr w:type="spellEnd"/>
+      <w:r>
+        <w:rPr>
+          <w:rFonts w:ascii="Courier New" w:hAnsi="Courier New" w:cs="Courier New"/>
+          <w:sz w:val="22"/>
+          <w:szCs w:val="22"/>
+          <w:lang w:val="nl-NL"/>
+        </w:rPr>
+        <w:t xml:space="preserve"> en ook Kooistra. Door het vraagstuk </w:t>
+      </w:r>
     </w:p>
     <w:p>
       <w:pPr>

</xml_diff>

<commit_message>
26-03-30, Blog Kooistra bijgewerkt
</commit_message>
<xml_diff>
--- a/BlogsWord/Stapstenenomrichtingtegeven.docx
+++ b/BlogsWord/Stapstenenomrichtingtegeven.docx
@@ -2908,7 +2908,25 @@
           <w:szCs w:val="22"/>
           <w:lang w:val="nl-NL"/>
         </w:rPr>
-        <w:t xml:space="preserve">. Als dezelfde belastinginkomsten via vermogensbelastingen zouden worden geheven is iedereen verplicht om acht procent van zijn vermogen aan de staat af te dragen. Dan zou er één belasting zijn (vermogensbelasting) en </w:t>
+        <w:t>. Als dezelfde belastinginkomsten via vermogensbelastingen zouden worden geheven is iedereen verplicht om acht procent van zijn vermogen aan de staat af te dragen</w:t>
+      </w:r>
+      <w:r>
+        <w:rPr>
+          <w:rFonts w:ascii="Courier New" w:hAnsi="Courier New" w:cs="Courier New"/>
+          <w:sz w:val="22"/>
+          <w:szCs w:val="22"/>
+          <w:lang w:val="nl-NL"/>
+        </w:rPr>
+        <w:t>, is zijn schatting</w:t>
+      </w:r>
+      <w:r>
+        <w:rPr>
+          <w:rFonts w:ascii="Courier New" w:hAnsi="Courier New" w:cs="Courier New"/>
+          <w:sz w:val="22"/>
+          <w:szCs w:val="22"/>
+          <w:lang w:val="nl-NL"/>
+        </w:rPr>
+        <w:t xml:space="preserve">. Dan zou er één belasting zijn (vermogensbelasting) en </w:t>
       </w:r>
       <w:r>
         <w:rPr>
@@ -2944,7 +2962,43 @@
           <w:szCs w:val="22"/>
           <w:lang w:val="nl-NL"/>
         </w:rPr>
-        <w:t xml:space="preserve"> afgeschaft. Kooistra is duidelijk, er zijn hele goede redenen om het huidige systeem af te schaffen en zeker als we naar het belastingsysteem kijken vanuit het perspectief van vrijheid en gelijkheid. </w:t>
+        <w:t xml:space="preserve"> afgeschaft. Kooistra is duidelijk</w:t>
+      </w:r>
+      <w:r>
+        <w:rPr>
+          <w:rFonts w:ascii="Courier New" w:hAnsi="Courier New" w:cs="Courier New"/>
+          <w:sz w:val="22"/>
+          <w:szCs w:val="22"/>
+          <w:lang w:val="nl-NL"/>
+        </w:rPr>
+        <w:t>. E</w:t>
+      </w:r>
+      <w:r>
+        <w:rPr>
+          <w:rFonts w:ascii="Courier New" w:hAnsi="Courier New" w:cs="Courier New"/>
+          <w:sz w:val="22"/>
+          <w:szCs w:val="22"/>
+          <w:lang w:val="nl-NL"/>
+        </w:rPr>
+        <w:t>r zijn hele goede redenen om het huidige systeem af te schaffen</w:t>
+      </w:r>
+      <w:r>
+        <w:rPr>
+          <w:rFonts w:ascii="Courier New" w:hAnsi="Courier New" w:cs="Courier New"/>
+          <w:sz w:val="22"/>
+          <w:szCs w:val="22"/>
+          <w:lang w:val="nl-NL"/>
+        </w:rPr>
+        <w:t xml:space="preserve">, </w:t>
+      </w:r>
+      <w:r>
+        <w:rPr>
+          <w:rFonts w:ascii="Courier New" w:hAnsi="Courier New" w:cs="Courier New"/>
+          <w:sz w:val="22"/>
+          <w:szCs w:val="22"/>
+          <w:lang w:val="nl-NL"/>
+        </w:rPr>
+        <w:t xml:space="preserve">zeker als we naar het belastingsysteem kijken vanuit het perspectief van vrijheid en gelijkheid. </w:t>
       </w:r>
       <w:r>
         <w:rPr>
@@ -3016,29 +3070,79 @@
           <w:szCs w:val="22"/>
           <w:lang w:val="nl-NL"/>
         </w:rPr>
-        <w:t xml:space="preserve">in te voeren en voor dat nieuwe systeem de tijd te </w:t>
-      </w:r>
-      <w:proofErr w:type="spellStart"/>
-      <w:proofErr w:type="gramStart"/>
-      <w:r>
-        <w:rPr>
-          <w:rFonts w:ascii="Courier New" w:hAnsi="Courier New" w:cs="Courier New"/>
-          <w:sz w:val="22"/>
-          <w:szCs w:val="22"/>
-          <w:lang w:val="nl-NL"/>
-        </w:rPr>
-        <w:t>nemen.Bijvoorbeeld</w:t>
-      </w:r>
-      <w:proofErr w:type="spellEnd"/>
-      <w:proofErr w:type="gramEnd"/>
-      <w:r>
-        <w:rPr>
-          <w:rFonts w:ascii="Courier New" w:hAnsi="Courier New" w:cs="Courier New"/>
-          <w:sz w:val="22"/>
-          <w:szCs w:val="22"/>
-          <w:lang w:val="nl-NL"/>
-        </w:rPr>
-        <w:t xml:space="preserve"> door te beginnen met 1 procent belasting op het vermogen te rekenen en daarmee andere belastingen langzaam te kunnen afbouwen, bijvoorbeeld die op het arbeidsinkomen te verminderen zodat meer mensen vermogen kunnen opbouwen. </w:t>
+        <w:t>in te voeren en voor dat nieuwe systeem de tijd te nemen.</w:t>
+      </w:r>
+      <w:r>
+        <w:rPr>
+          <w:rFonts w:ascii="Courier New" w:hAnsi="Courier New" w:cs="Courier New"/>
+          <w:sz w:val="22"/>
+          <w:szCs w:val="22"/>
+          <w:lang w:val="nl-NL"/>
+        </w:rPr>
+        <w:t xml:space="preserve"> </w:t>
+      </w:r>
+      <w:r>
+        <w:rPr>
+          <w:rFonts w:ascii="Courier New" w:hAnsi="Courier New" w:cs="Courier New"/>
+          <w:sz w:val="22"/>
+          <w:szCs w:val="22"/>
+          <w:lang w:val="nl-NL"/>
+        </w:rPr>
+        <w:t>Bijvoorbeeld door te beginnen met 1 procent belasting op het vermogen te rekenen en daarmee andere belastingen langzaam te kunnen afbouwen</w:t>
+      </w:r>
+      <w:r>
+        <w:rPr>
+          <w:rFonts w:ascii="Courier New" w:hAnsi="Courier New" w:cs="Courier New"/>
+          <w:sz w:val="22"/>
+          <w:szCs w:val="22"/>
+          <w:lang w:val="nl-NL"/>
+        </w:rPr>
+        <w:t>. De belasting op h</w:t>
+      </w:r>
+      <w:r>
+        <w:rPr>
+          <w:rFonts w:ascii="Courier New" w:hAnsi="Courier New" w:cs="Courier New"/>
+          <w:sz w:val="22"/>
+          <w:szCs w:val="22"/>
+          <w:lang w:val="nl-NL"/>
+        </w:rPr>
+        <w:t xml:space="preserve">et arbeidsinkomen </w:t>
+      </w:r>
+      <w:r>
+        <w:rPr>
+          <w:rFonts w:ascii="Courier New" w:hAnsi="Courier New" w:cs="Courier New"/>
+          <w:sz w:val="22"/>
+          <w:szCs w:val="22"/>
+          <w:lang w:val="nl-NL"/>
+        </w:rPr>
+        <w:t>kan dan worden</w:t>
+      </w:r>
+      <w:r>
+        <w:rPr>
+          <w:rFonts w:ascii="Courier New" w:hAnsi="Courier New" w:cs="Courier New"/>
+          <w:sz w:val="22"/>
+          <w:szCs w:val="22"/>
+          <w:lang w:val="nl-NL"/>
+        </w:rPr>
+        <w:t xml:space="preserve"> verminder</w:t>
+      </w:r>
+      <w:r>
+        <w:rPr>
+          <w:rFonts w:ascii="Courier New" w:hAnsi="Courier New" w:cs="Courier New"/>
+          <w:sz w:val="22"/>
+          <w:szCs w:val="22"/>
+          <w:lang w:val="nl-NL"/>
+        </w:rPr>
+        <w:t>d</w:t>
+      </w:r>
+      <w:r>
+        <w:rPr>
+          <w:rFonts w:ascii="Courier New" w:hAnsi="Courier New" w:cs="Courier New"/>
+          <w:sz w:val="22"/>
+          <w:szCs w:val="22"/>
+          <w:lang w:val="nl-NL"/>
+        </w:rPr>
+        <w:t xml:space="preserve"> zodat meer mensen vermogen kunnen opbouwen.</w:t>
       </w:r>
     </w:p>
     <w:p>
@@ -3059,7 +3163,25 @@
           <w:lang w:val="nl-NL"/>
         </w:rPr>
         <w:tab/>
-        <w:t xml:space="preserve">Dit komt weer overheen met </w:t>
+        <w:t xml:space="preserve">Dit </w:t>
+      </w:r>
+      <w:r>
+        <w:rPr>
+          <w:rFonts w:ascii="Courier New" w:hAnsi="Courier New" w:cs="Courier New"/>
+          <w:sz w:val="22"/>
+          <w:szCs w:val="22"/>
+          <w:lang w:val="nl-NL"/>
+        </w:rPr>
+        <w:t xml:space="preserve">idee </w:t>
+      </w:r>
+      <w:r>
+        <w:rPr>
+          <w:rFonts w:ascii="Courier New" w:hAnsi="Courier New" w:cs="Courier New"/>
+          <w:sz w:val="22"/>
+          <w:szCs w:val="22"/>
+          <w:lang w:val="nl-NL"/>
+        </w:rPr>
+        <w:t xml:space="preserve">komt overheen met </w:t>
       </w:r>
       <w:r>
         <w:rPr>
@@ -3070,6 +3192,24 @@
         </w:rPr>
         <w:t xml:space="preserve">de </w:t>
       </w:r>
+      <w:r>
+        <w:rPr>
+          <w:rFonts w:ascii="Courier New" w:hAnsi="Courier New" w:cs="Courier New"/>
+          <w:sz w:val="22"/>
+          <w:szCs w:val="22"/>
+          <w:lang w:val="nl-NL"/>
+        </w:rPr>
+        <w:t>ideeën</w:t>
+      </w:r>
+      <w:r>
+        <w:rPr>
+          <w:rFonts w:ascii="Courier New" w:hAnsi="Courier New" w:cs="Courier New"/>
+          <w:sz w:val="22"/>
+          <w:szCs w:val="22"/>
+          <w:lang w:val="nl-NL"/>
+        </w:rPr>
+        <w:t xml:space="preserve"> van Gabriel </w:t>
+      </w:r>
       <w:proofErr w:type="spellStart"/>
       <w:r>
         <w:rPr>
@@ -3078,7 +3218,7 @@
           <w:szCs w:val="22"/>
           <w:lang w:val="nl-NL"/>
         </w:rPr>
-        <w:t>ideeên</w:t>
+        <w:t>Zucman</w:t>
       </w:r>
       <w:proofErr w:type="spellEnd"/>
       <w:r>
@@ -3088,27 +3228,25 @@
           <w:szCs w:val="22"/>
           <w:lang w:val="nl-NL"/>
         </w:rPr>
-        <w:t xml:space="preserve"> van Gabriel </w:t>
-      </w:r>
-      <w:proofErr w:type="spellStart"/>
-      <w:r>
-        <w:rPr>
-          <w:rFonts w:ascii="Courier New" w:hAnsi="Courier New" w:cs="Courier New"/>
-          <w:sz w:val="22"/>
-          <w:szCs w:val="22"/>
-          <w:lang w:val="nl-NL"/>
-        </w:rPr>
-        <w:t>Zucman</w:t>
-      </w:r>
-      <w:proofErr w:type="spellEnd"/>
-      <w:r>
-        <w:rPr>
-          <w:rFonts w:ascii="Courier New" w:hAnsi="Courier New" w:cs="Courier New"/>
-          <w:sz w:val="22"/>
-          <w:szCs w:val="22"/>
-          <w:lang w:val="nl-NL"/>
-        </w:rPr>
-        <w:t xml:space="preserve"> die in </w:t>
+        <w:t xml:space="preserve"> die </w:t>
+      </w:r>
+      <w:r>
+        <w:rPr>
+          <w:rFonts w:ascii="Courier New" w:hAnsi="Courier New" w:cs="Courier New"/>
+          <w:sz w:val="22"/>
+          <w:szCs w:val="22"/>
+          <w:lang w:val="nl-NL"/>
+        </w:rPr>
+        <w:t>met</w:t>
+      </w:r>
+      <w:r>
+        <w:rPr>
+          <w:rFonts w:ascii="Courier New" w:hAnsi="Courier New" w:cs="Courier New"/>
+          <w:sz w:val="22"/>
+          <w:szCs w:val="22"/>
+          <w:lang w:val="nl-NL"/>
+        </w:rPr>
+        <w:t xml:space="preserve"> </w:t>
       </w:r>
       <w:r>
         <w:rPr>
@@ -3128,7 +3266,43 @@
           <w:szCs w:val="22"/>
           <w:lang w:val="nl-NL"/>
         </w:rPr>
-        <w:t xml:space="preserve"> voorstel om superrijken (zij met een vermogen van 100 miljoen</w:t>
+        <w:t xml:space="preserve"> </w:t>
+      </w:r>
+      <w:r>
+        <w:rPr>
+          <w:rFonts w:ascii="Courier New" w:hAnsi="Courier New" w:cs="Courier New"/>
+          <w:sz w:val="22"/>
+          <w:szCs w:val="22"/>
+          <w:lang w:val="nl-NL"/>
+        </w:rPr>
+        <w:t xml:space="preserve">onlangs een </w:t>
+      </w:r>
+      <w:r>
+        <w:rPr>
+          <w:rFonts w:ascii="Courier New" w:hAnsi="Courier New" w:cs="Courier New"/>
+          <w:sz w:val="22"/>
+          <w:szCs w:val="22"/>
+          <w:lang w:val="nl-NL"/>
+        </w:rPr>
+        <w:t xml:space="preserve">voorstel </w:t>
+      </w:r>
+      <w:r>
+        <w:rPr>
+          <w:rFonts w:ascii="Courier New" w:hAnsi="Courier New" w:cs="Courier New"/>
+          <w:sz w:val="22"/>
+          <w:szCs w:val="22"/>
+          <w:lang w:val="nl-NL"/>
+        </w:rPr>
+        <w:t xml:space="preserve">formuleerde </w:t>
+      </w:r>
+      <w:r>
+        <w:rPr>
+          <w:rFonts w:ascii="Courier New" w:hAnsi="Courier New" w:cs="Courier New"/>
+          <w:sz w:val="22"/>
+          <w:szCs w:val="22"/>
+          <w:lang w:val="nl-NL"/>
+        </w:rPr>
+        <w:t>om superrijken (zij met een vermogen van 100 miljoen</w:t>
       </w:r>
       <w:r>
         <w:rPr>
@@ -3146,16 +3320,7 @@
           <w:szCs w:val="22"/>
           <w:lang w:val="nl-NL"/>
         </w:rPr>
-        <w:t>De machtigste mensen in de samenleving dragen nu niet naar draagkracht bij en dat is een schending van de fundamentele principes van rechtvaardigheid. Alle sociale klassen betalen ongeveer de helft van hun inkomen aan belasting, behalve de miljardairs die zo’n 13% betalen</w:t>
-      </w:r>
-      <w:r>
-        <w:rPr>
-          <w:rFonts w:ascii="Courier New" w:hAnsi="Courier New" w:cs="Courier New"/>
-          <w:sz w:val="22"/>
-          <w:szCs w:val="22"/>
-          <w:lang w:val="nl-NL"/>
-        </w:rPr>
-        <w:t xml:space="preserve">. Zij halen vooral hun rijkdom uit de bedrijven die ze bezitten. De meeste mensen geven het grootste deel van hun inkomen aan belasting uit en voor de superrijken geldt het tegenovergestelde. En zo is de wereld een belastingparadijs voor miljardairs geworden waar </w:t>
+        <w:t xml:space="preserve">Ook </w:t>
       </w:r>
       <w:proofErr w:type="spellStart"/>
       <w:r>
@@ -3175,12 +3340,142 @@
           <w:szCs w:val="22"/>
           <w:lang w:val="nl-NL"/>
         </w:rPr>
-        <w:t xml:space="preserve"> een einde aan wil maken.</w:t>
+        <w:t xml:space="preserve"> stelt dat de </w:t>
+      </w:r>
+      <w:r>
+        <w:rPr>
+          <w:rFonts w:ascii="Courier New" w:hAnsi="Courier New" w:cs="Courier New"/>
+          <w:sz w:val="22"/>
+          <w:szCs w:val="22"/>
+          <w:lang w:val="nl-NL"/>
+        </w:rPr>
+        <w:t>machtigste mensen in de samenleving nu niet naar draagkracht bij</w:t>
+      </w:r>
+      <w:r>
+        <w:rPr>
+          <w:rFonts w:ascii="Courier New" w:hAnsi="Courier New" w:cs="Courier New"/>
+          <w:sz w:val="22"/>
+          <w:szCs w:val="22"/>
+          <w:lang w:val="nl-NL"/>
+        </w:rPr>
+        <w:t>dragen</w:t>
+      </w:r>
+      <w:r>
+        <w:rPr>
+          <w:rFonts w:ascii="Courier New" w:hAnsi="Courier New" w:cs="Courier New"/>
+          <w:sz w:val="22"/>
+          <w:szCs w:val="22"/>
+          <w:lang w:val="nl-NL"/>
+        </w:rPr>
+        <w:t xml:space="preserve"> en dat is </w:t>
+      </w:r>
+      <w:r>
+        <w:rPr>
+          <w:rFonts w:ascii="Courier New" w:hAnsi="Courier New" w:cs="Courier New"/>
+          <w:sz w:val="22"/>
+          <w:szCs w:val="22"/>
+          <w:lang w:val="nl-NL"/>
+        </w:rPr>
+        <w:t xml:space="preserve">ook volgens hem </w:t>
+      </w:r>
+      <w:r>
+        <w:rPr>
+          <w:rFonts w:ascii="Courier New" w:hAnsi="Courier New" w:cs="Courier New"/>
+          <w:sz w:val="22"/>
+          <w:szCs w:val="22"/>
+          <w:lang w:val="nl-NL"/>
+        </w:rPr>
+        <w:t>een schending van de fundamentele principes van rechtvaardigheid. Alle sociale klassen betalen ongeveer de helft van hun inkomen aan belasting, behalve de miljardairs die zo’n 13% betalen. Zij halen vooral hun rijkdom uit de bedrijven die ze bezitten. De meeste mensen geven het grootste deel van hun inkomen aan belasting uit</w:t>
+      </w:r>
+      <w:r>
+        <w:rPr>
+          <w:rFonts w:ascii="Courier New" w:hAnsi="Courier New" w:cs="Courier New"/>
+          <w:sz w:val="22"/>
+          <w:szCs w:val="22"/>
+          <w:lang w:val="nl-NL"/>
+        </w:rPr>
+        <w:t xml:space="preserve">, </w:t>
+      </w:r>
+      <w:r>
+        <w:rPr>
+          <w:rFonts w:ascii="Courier New" w:hAnsi="Courier New" w:cs="Courier New"/>
+          <w:sz w:val="22"/>
+          <w:szCs w:val="22"/>
+          <w:lang w:val="nl-NL"/>
+        </w:rPr>
+        <w:t>voor de superrijken geldt het tegenovergestelde.</w:t>
+      </w:r>
+      <w:r>
+        <w:rPr>
+          <w:rFonts w:ascii="Courier New" w:hAnsi="Courier New" w:cs="Courier New"/>
+          <w:sz w:val="22"/>
+          <w:szCs w:val="22"/>
+          <w:lang w:val="nl-NL"/>
+        </w:rPr>
+        <w:t xml:space="preserve"> </w:t>
+      </w:r>
+      <w:r>
+        <w:rPr>
+          <w:rFonts w:ascii="Courier New" w:hAnsi="Courier New" w:cs="Courier New"/>
+          <w:sz w:val="22"/>
+          <w:szCs w:val="22"/>
+          <w:lang w:val="nl-NL"/>
+        </w:rPr>
+        <w:lastRenderedPageBreak/>
+        <w:t>Zo</w:t>
+      </w:r>
+      <w:r>
+        <w:rPr>
+          <w:rFonts w:ascii="Courier New" w:hAnsi="Courier New" w:cs="Courier New"/>
+          <w:sz w:val="22"/>
+          <w:szCs w:val="22"/>
+          <w:lang w:val="nl-NL"/>
+        </w:rPr>
+        <w:t xml:space="preserve"> is de wereld een belastingparadijs voor miljardairs geworden waar </w:t>
+      </w:r>
+      <w:proofErr w:type="spellStart"/>
+      <w:r>
+        <w:rPr>
+          <w:rFonts w:ascii="Courier New" w:hAnsi="Courier New" w:cs="Courier New"/>
+          <w:sz w:val="22"/>
+          <w:szCs w:val="22"/>
+          <w:lang w:val="nl-NL"/>
+        </w:rPr>
+        <w:t>Zucman</w:t>
+      </w:r>
+      <w:proofErr w:type="spellEnd"/>
+      <w:r>
+        <w:rPr>
+          <w:rFonts w:ascii="Courier New" w:hAnsi="Courier New" w:cs="Courier New"/>
+          <w:sz w:val="22"/>
+          <w:szCs w:val="22"/>
+          <w:lang w:val="nl-NL"/>
+        </w:rPr>
+        <w:t xml:space="preserve"> een einde aan wil maken</w:t>
+      </w:r>
+      <w:r>
+        <w:rPr>
+          <w:rFonts w:ascii="Courier New" w:hAnsi="Courier New" w:cs="Courier New"/>
+          <w:sz w:val="22"/>
+          <w:szCs w:val="22"/>
+          <w:lang w:val="nl-NL"/>
+        </w:rPr>
+        <w:t xml:space="preserve"> met zijn politieke pamflet</w:t>
+      </w:r>
+      <w:r>
+        <w:rPr>
+          <w:rFonts w:ascii="Courier New" w:hAnsi="Courier New" w:cs="Courier New"/>
+          <w:sz w:val="22"/>
+          <w:szCs w:val="22"/>
+          <w:lang w:val="nl-NL"/>
+        </w:rPr>
+        <w:t>.</w:t>
       </w:r>
     </w:p>
     <w:p>
       <w:pPr>
         <w:spacing w:line="360" w:lineRule="auto"/>
+        <w:ind w:firstLine="720"/>
         <w:rPr>
           <w:rFonts w:ascii="Courier New" w:hAnsi="Courier New" w:cs="Courier New"/>
           <w:sz w:val="22"/>
@@ -3195,7 +3490,114 @@
           <w:szCs w:val="22"/>
           <w:lang w:val="nl-NL"/>
         </w:rPr>
-        <w:lastRenderedPageBreak/>
+        <w:t xml:space="preserve">Kooiman laat je met zijn boek beter nadenken over de kwestie. Zo </w:t>
+      </w:r>
+      <w:r>
+        <w:rPr>
+          <w:rFonts w:ascii="Courier New" w:hAnsi="Courier New" w:cs="Courier New"/>
+          <w:sz w:val="22"/>
+          <w:szCs w:val="22"/>
+          <w:lang w:val="nl-NL"/>
+        </w:rPr>
+        <w:t xml:space="preserve">stelt </w:t>
+      </w:r>
+      <w:r>
+        <w:rPr>
+          <w:rFonts w:ascii="Courier New" w:hAnsi="Courier New" w:cs="Courier New"/>
+          <w:sz w:val="22"/>
+          <w:szCs w:val="22"/>
+          <w:lang w:val="nl-NL"/>
+        </w:rPr>
+        <w:t xml:space="preserve">hij </w:t>
+      </w:r>
+      <w:r>
+        <w:rPr>
+          <w:rFonts w:ascii="Courier New" w:hAnsi="Courier New" w:cs="Courier New"/>
+          <w:sz w:val="22"/>
+          <w:szCs w:val="22"/>
+          <w:lang w:val="nl-NL"/>
+        </w:rPr>
+        <w:t>in zijn boek de korte en terechte vraag: v</w:t>
+      </w:r>
+      <w:r>
+        <w:rPr>
+          <w:rFonts w:ascii="Courier New" w:hAnsi="Courier New" w:cs="Courier New"/>
+          <w:sz w:val="22"/>
+          <w:szCs w:val="22"/>
+          <w:lang w:val="nl-NL"/>
+        </w:rPr>
+        <w:t>an wie is de wereld?</w:t>
+      </w:r>
+      <w:r>
+        <w:rPr>
+          <w:rFonts w:ascii="Courier New" w:hAnsi="Courier New" w:cs="Courier New"/>
+          <w:sz w:val="22"/>
+          <w:szCs w:val="22"/>
+          <w:lang w:val="nl-NL"/>
+        </w:rPr>
+        <w:t xml:space="preserve"> Hij laat zien dat </w:t>
+      </w:r>
+      <w:r>
+        <w:rPr>
+          <w:rFonts w:ascii="Courier New" w:hAnsi="Courier New" w:cs="Courier New"/>
+          <w:sz w:val="22"/>
+          <w:szCs w:val="22"/>
+          <w:lang w:val="nl-NL"/>
+        </w:rPr>
+        <w:t xml:space="preserve">er </w:t>
+      </w:r>
+      <w:r>
+        <w:rPr>
+          <w:rFonts w:ascii="Courier New" w:hAnsi="Courier New" w:cs="Courier New"/>
+          <w:sz w:val="22"/>
+          <w:szCs w:val="22"/>
+          <w:lang w:val="nl-NL"/>
+        </w:rPr>
+        <w:t>in</w:t>
+      </w:r>
+      <w:r>
+        <w:rPr>
+          <w:rFonts w:ascii="Courier New" w:hAnsi="Courier New" w:cs="Courier New"/>
+          <w:sz w:val="22"/>
+          <w:szCs w:val="22"/>
+          <w:lang w:val="nl-NL"/>
+        </w:rPr>
+        <w:t xml:space="preserve"> de geschiedenis </w:t>
+      </w:r>
+      <w:r>
+        <w:rPr>
+          <w:rFonts w:ascii="Courier New" w:hAnsi="Courier New" w:cs="Courier New"/>
+          <w:sz w:val="22"/>
+          <w:szCs w:val="22"/>
+          <w:lang w:val="nl-NL"/>
+        </w:rPr>
+        <w:t>van belasting (waarop hij in het eerste deel van het boek soms net iets te lang door</w:t>
+      </w:r>
+      <w:r>
+        <w:rPr>
+          <w:rFonts w:ascii="Courier New" w:hAnsi="Courier New" w:cs="Courier New"/>
+          <w:sz w:val="22"/>
+          <w:szCs w:val="22"/>
+          <w:lang w:val="nl-NL"/>
+        </w:rPr>
+        <w:t>loopt</w:t>
+      </w:r>
+      <w:r>
+        <w:rPr>
+          <w:rFonts w:ascii="Courier New" w:hAnsi="Courier New" w:cs="Courier New"/>
+          <w:sz w:val="22"/>
+          <w:szCs w:val="22"/>
+          <w:lang w:val="nl-NL"/>
+        </w:rPr>
+        <w:t>)</w:t>
+      </w:r>
+      <w:r>
+        <w:rPr>
+          <w:rFonts w:ascii="Courier New" w:hAnsi="Courier New" w:cs="Courier New"/>
+          <w:sz w:val="22"/>
+          <w:szCs w:val="22"/>
+          <w:lang w:val="nl-NL"/>
+        </w:rPr>
         <w:t xml:space="preserve"> </w:t>
       </w:r>
       <w:r>
@@ -3205,198 +3607,255 @@
           <w:szCs w:val="22"/>
           <w:lang w:val="nl-NL"/>
         </w:rPr>
+        <w:t>maar</w:t>
+      </w:r>
+      <w:r>
+        <w:rPr>
+          <w:rFonts w:ascii="Courier New" w:hAnsi="Courier New" w:cs="Courier New"/>
+          <w:sz w:val="22"/>
+          <w:szCs w:val="22"/>
+          <w:lang w:val="nl-NL"/>
+        </w:rPr>
+        <w:t xml:space="preserve"> een hele dunne draad van rechtvaardigheid</w:t>
+      </w:r>
+      <w:r>
+        <w:rPr>
+          <w:rFonts w:ascii="Courier New" w:hAnsi="Courier New" w:cs="Courier New"/>
+          <w:sz w:val="22"/>
+          <w:szCs w:val="22"/>
+          <w:lang w:val="nl-NL"/>
+        </w:rPr>
+        <w:t xml:space="preserve"> loopt</w:t>
+      </w:r>
+      <w:r>
+        <w:rPr>
+          <w:rFonts w:ascii="Courier New" w:hAnsi="Courier New" w:cs="Courier New"/>
+          <w:sz w:val="22"/>
+          <w:szCs w:val="22"/>
+          <w:lang w:val="nl-NL"/>
+        </w:rPr>
+        <w:t>.</w:t>
+      </w:r>
+      <w:r>
+        <w:rPr>
+          <w:rFonts w:ascii="Courier New" w:hAnsi="Courier New" w:cs="Courier New"/>
+          <w:sz w:val="22"/>
+          <w:szCs w:val="22"/>
+          <w:lang w:val="nl-NL"/>
+        </w:rPr>
+        <w:t xml:space="preserve"> Daar is sprake van in een bepaalde </w:t>
+      </w:r>
+      <w:r>
+        <w:rPr>
+          <w:rFonts w:ascii="Courier New" w:hAnsi="Courier New" w:cs="Courier New"/>
+          <w:sz w:val="22"/>
+          <w:szCs w:val="22"/>
+          <w:lang w:val="nl-NL"/>
+        </w:rPr>
+        <w:t xml:space="preserve">korte </w:t>
+      </w:r>
+      <w:r>
+        <w:rPr>
+          <w:rFonts w:ascii="Courier New" w:hAnsi="Courier New" w:cs="Courier New"/>
+          <w:sz w:val="22"/>
+          <w:szCs w:val="22"/>
+          <w:lang w:val="nl-NL"/>
+        </w:rPr>
+        <w:t>periode in de Italiaanse stadsstaten, het werk van enkele Middeleeuwse juristen en de periode na de Tweede Wereldoorlog wa</w:t>
+      </w:r>
+      <w:r>
+        <w:rPr>
+          <w:rFonts w:ascii="Courier New" w:hAnsi="Courier New" w:cs="Courier New"/>
+          <w:sz w:val="22"/>
+          <w:szCs w:val="22"/>
+          <w:lang w:val="nl-NL"/>
+        </w:rPr>
+        <w:t>nneer</w:t>
+      </w:r>
+      <w:r>
+        <w:rPr>
+          <w:rFonts w:ascii="Courier New" w:hAnsi="Courier New" w:cs="Courier New"/>
+          <w:sz w:val="22"/>
+          <w:szCs w:val="22"/>
+          <w:lang w:val="nl-NL"/>
+        </w:rPr>
+        <w:t xml:space="preserve"> er </w:t>
+      </w:r>
+      <w:r>
+        <w:rPr>
+          <w:rFonts w:ascii="Courier New" w:hAnsi="Courier New" w:cs="Courier New"/>
+          <w:sz w:val="22"/>
+          <w:szCs w:val="22"/>
+          <w:lang w:val="nl-NL"/>
+        </w:rPr>
+        <w:t xml:space="preserve">in de westerse wereld daadwerkelijk </w:t>
+      </w:r>
+      <w:r>
+        <w:rPr>
+          <w:rFonts w:ascii="Courier New" w:hAnsi="Courier New" w:cs="Courier New"/>
+          <w:sz w:val="22"/>
+          <w:szCs w:val="22"/>
+          <w:lang w:val="nl-NL"/>
+        </w:rPr>
+        <w:t xml:space="preserve">meer gelijkheid </w:t>
+      </w:r>
+      <w:r>
+        <w:rPr>
+          <w:rFonts w:ascii="Courier New" w:hAnsi="Courier New" w:cs="Courier New"/>
+          <w:sz w:val="22"/>
+          <w:szCs w:val="22"/>
+          <w:lang w:val="nl-NL"/>
+        </w:rPr>
+        <w:t>is gekomen</w:t>
+      </w:r>
+      <w:r>
+        <w:rPr>
+          <w:rFonts w:ascii="Courier New" w:hAnsi="Courier New" w:cs="Courier New"/>
+          <w:sz w:val="22"/>
+          <w:szCs w:val="22"/>
+          <w:lang w:val="nl-NL"/>
+        </w:rPr>
+        <w:t xml:space="preserve">. Het onderwerp </w:t>
+      </w:r>
+      <w:r>
+        <w:rPr>
+          <w:rFonts w:ascii="Courier New" w:hAnsi="Courier New" w:cs="Courier New"/>
+          <w:sz w:val="22"/>
+          <w:szCs w:val="22"/>
+          <w:lang w:val="nl-NL"/>
+        </w:rPr>
+        <w:t xml:space="preserve">gelijkheid </w:t>
+      </w:r>
+      <w:r>
+        <w:rPr>
+          <w:rFonts w:ascii="Courier New" w:hAnsi="Courier New" w:cs="Courier New"/>
+          <w:sz w:val="22"/>
+          <w:szCs w:val="22"/>
+          <w:lang w:val="nl-NL"/>
+        </w:rPr>
+        <w:t xml:space="preserve">is terug op de agenda via mensen als </w:t>
+      </w:r>
+      <w:proofErr w:type="spellStart"/>
+      <w:r>
+        <w:rPr>
+          <w:rFonts w:ascii="Courier New" w:hAnsi="Courier New" w:cs="Courier New"/>
+          <w:sz w:val="22"/>
+          <w:szCs w:val="22"/>
+          <w:lang w:val="nl-NL"/>
+        </w:rPr>
+        <w:t>Piketty</w:t>
+      </w:r>
+      <w:proofErr w:type="spellEnd"/>
+      <w:r>
+        <w:rPr>
+          <w:rFonts w:ascii="Courier New" w:hAnsi="Courier New" w:cs="Courier New"/>
+          <w:sz w:val="22"/>
+          <w:szCs w:val="22"/>
+          <w:lang w:val="nl-NL"/>
+        </w:rPr>
+        <w:t xml:space="preserve">, </w:t>
+      </w:r>
+      <w:proofErr w:type="spellStart"/>
+      <w:r>
+        <w:rPr>
+          <w:rFonts w:ascii="Courier New" w:hAnsi="Courier New" w:cs="Courier New"/>
+          <w:sz w:val="22"/>
+          <w:szCs w:val="22"/>
+          <w:lang w:val="nl-NL"/>
+        </w:rPr>
+        <w:t>Zucman</w:t>
+      </w:r>
+      <w:proofErr w:type="spellEnd"/>
+      <w:r>
+        <w:rPr>
+          <w:rFonts w:ascii="Courier New" w:hAnsi="Courier New" w:cs="Courier New"/>
+          <w:sz w:val="22"/>
+          <w:szCs w:val="22"/>
+          <w:lang w:val="nl-NL"/>
+        </w:rPr>
+        <w:t xml:space="preserve"> en </w:t>
+      </w:r>
+      <w:r>
+        <w:rPr>
+          <w:rFonts w:ascii="Courier New" w:hAnsi="Courier New" w:cs="Courier New"/>
+          <w:sz w:val="22"/>
+          <w:szCs w:val="22"/>
+          <w:lang w:val="nl-NL"/>
+        </w:rPr>
+        <w:t>het inspirerende boek van</w:t>
+      </w:r>
+      <w:r>
+        <w:rPr>
+          <w:rFonts w:ascii="Courier New" w:hAnsi="Courier New" w:cs="Courier New"/>
+          <w:sz w:val="22"/>
+          <w:szCs w:val="22"/>
+          <w:lang w:val="nl-NL"/>
+        </w:rPr>
+        <w:t xml:space="preserve"> Kooistra.</w:t>
+      </w:r>
+      <w:r>
+        <w:rPr>
+          <w:rFonts w:ascii="Courier New" w:hAnsi="Courier New" w:cs="Courier New"/>
+          <w:sz w:val="22"/>
+          <w:szCs w:val="22"/>
+          <w:lang w:val="nl-NL"/>
+        </w:rPr>
+        <w:t xml:space="preserve"> Ook in andere landen als Denemarken, VS en Spanje is het een belangrijk onderwerp geworden. Ook in ons land zal er meer over gesproken worden. </w:t>
+      </w:r>
+      <w:r>
+        <w:rPr>
+          <w:rFonts w:ascii="Courier New" w:hAnsi="Courier New" w:cs="Courier New"/>
+          <w:sz w:val="22"/>
+          <w:szCs w:val="22"/>
+          <w:lang w:val="nl-NL"/>
+        </w:rPr>
+        <w:t xml:space="preserve">Want als Kooiman iets duidelijk maakt is dat het onbegrijpelijk is dat hier nauwelijks over wordt gesproken. </w:t>
+      </w:r>
+      <w:r>
+        <w:rPr>
+          <w:rFonts w:ascii="Courier New" w:hAnsi="Courier New" w:cs="Courier New"/>
+          <w:sz w:val="22"/>
+          <w:szCs w:val="22"/>
+          <w:lang w:val="nl-NL"/>
+        </w:rPr>
+        <w:t>Praten over de onderliggende principes is belangrijke</w:t>
+      </w:r>
+      <w:r>
+        <w:rPr>
+          <w:rFonts w:ascii="Courier New" w:hAnsi="Courier New" w:cs="Courier New"/>
+          <w:sz w:val="22"/>
+          <w:szCs w:val="22"/>
+          <w:lang w:val="nl-NL"/>
+        </w:rPr>
+        <w:t>r</w:t>
+      </w:r>
+      <w:r>
+        <w:rPr>
+          <w:rFonts w:ascii="Courier New" w:hAnsi="Courier New" w:cs="Courier New"/>
+          <w:sz w:val="22"/>
+          <w:szCs w:val="22"/>
+          <w:lang w:val="nl-NL"/>
+        </w:rPr>
+        <w:t xml:space="preserve"> dan een nieuwe naam of logo. </w:t>
+      </w:r>
+      <w:r>
+        <w:rPr>
+          <w:rFonts w:ascii="Courier New" w:hAnsi="Courier New" w:cs="Courier New"/>
+          <w:sz w:val="22"/>
+          <w:szCs w:val="22"/>
+          <w:lang w:val="nl-NL"/>
+        </w:rPr>
+        <w:t>Iets aan gelijkheid doen is meer dan lange discussies over het eigen risico voor de gezondheidszorg. Gelijkheid was strijd en gelijkheid is nog steeds strijd.</w:t>
+      </w:r>
+      <w:r>
+        <w:rPr>
+          <w:rFonts w:ascii="Courier New" w:hAnsi="Courier New" w:cs="Courier New"/>
+          <w:sz w:val="22"/>
+          <w:szCs w:val="22"/>
+          <w:lang w:val="nl-NL"/>
+        </w:rPr>
         <w:t xml:space="preserve"> </w:t>
       </w:r>
-      <w:r>
-        <w:rPr>
-          <w:rFonts w:ascii="Courier New" w:hAnsi="Courier New" w:cs="Courier New"/>
-          <w:sz w:val="22"/>
-          <w:szCs w:val="22"/>
-          <w:lang w:val="nl-NL"/>
-        </w:rPr>
-        <w:t>Kooiman stelt in zijn boek de korte en terechte vraag: v</w:t>
-      </w:r>
-      <w:r>
-        <w:rPr>
-          <w:rFonts w:ascii="Courier New" w:hAnsi="Courier New" w:cs="Courier New"/>
-          <w:sz w:val="22"/>
-          <w:szCs w:val="22"/>
-          <w:lang w:val="nl-NL"/>
-        </w:rPr>
-        <w:t>an wie is de wereld?</w:t>
-      </w:r>
-      <w:r>
-        <w:rPr>
-          <w:rFonts w:ascii="Courier New" w:hAnsi="Courier New" w:cs="Courier New"/>
-          <w:sz w:val="22"/>
-          <w:szCs w:val="22"/>
-          <w:lang w:val="nl-NL"/>
-        </w:rPr>
-        <w:t xml:space="preserve"> Hij laat zien dat in</w:t>
-      </w:r>
-      <w:r>
-        <w:rPr>
-          <w:rFonts w:ascii="Courier New" w:hAnsi="Courier New" w:cs="Courier New"/>
-          <w:sz w:val="22"/>
-          <w:szCs w:val="22"/>
-          <w:lang w:val="nl-NL"/>
-        </w:rPr>
-        <w:t xml:space="preserve"> de geschiedenis </w:t>
-      </w:r>
-      <w:r>
-        <w:rPr>
-          <w:rFonts w:ascii="Courier New" w:hAnsi="Courier New" w:cs="Courier New"/>
-          <w:sz w:val="22"/>
-          <w:szCs w:val="22"/>
-          <w:lang w:val="nl-NL"/>
-        </w:rPr>
-        <w:t>van belastingen (waarop hij in het eerste deel van het boek soms net iets te lang door</w:t>
-      </w:r>
-      <w:r>
-        <w:rPr>
-          <w:rFonts w:ascii="Courier New" w:hAnsi="Courier New" w:cs="Courier New"/>
-          <w:sz w:val="22"/>
-          <w:szCs w:val="22"/>
-          <w:lang w:val="nl-NL"/>
-        </w:rPr>
-        <w:t>loopt</w:t>
-      </w:r>
-      <w:r>
-        <w:rPr>
-          <w:rFonts w:ascii="Courier New" w:hAnsi="Courier New" w:cs="Courier New"/>
-          <w:sz w:val="22"/>
-          <w:szCs w:val="22"/>
-          <w:lang w:val="nl-NL"/>
-        </w:rPr>
-        <w:t>)</w:t>
-      </w:r>
-      <w:r>
-        <w:rPr>
-          <w:rFonts w:ascii="Courier New" w:hAnsi="Courier New" w:cs="Courier New"/>
-          <w:sz w:val="22"/>
-          <w:szCs w:val="22"/>
-          <w:lang w:val="nl-NL"/>
-        </w:rPr>
-        <w:t xml:space="preserve"> </w:t>
-      </w:r>
-      <w:r>
-        <w:rPr>
-          <w:rFonts w:ascii="Courier New" w:hAnsi="Courier New" w:cs="Courier New"/>
-          <w:sz w:val="22"/>
-          <w:szCs w:val="22"/>
-          <w:lang w:val="nl-NL"/>
-        </w:rPr>
-        <w:t>er maar</w:t>
-      </w:r>
-      <w:r>
-        <w:rPr>
-          <w:rFonts w:ascii="Courier New" w:hAnsi="Courier New" w:cs="Courier New"/>
-          <w:sz w:val="22"/>
-          <w:szCs w:val="22"/>
-          <w:lang w:val="nl-NL"/>
-        </w:rPr>
-        <w:t xml:space="preserve"> een hele dunne draad van rechtvaardigheid</w:t>
-      </w:r>
-      <w:r>
-        <w:rPr>
-          <w:rFonts w:ascii="Courier New" w:hAnsi="Courier New" w:cs="Courier New"/>
-          <w:sz w:val="22"/>
-          <w:szCs w:val="22"/>
-          <w:lang w:val="nl-NL"/>
-        </w:rPr>
-        <w:t xml:space="preserve"> loopt</w:t>
-      </w:r>
-      <w:r>
-        <w:rPr>
-          <w:rFonts w:ascii="Courier New" w:hAnsi="Courier New" w:cs="Courier New"/>
-          <w:sz w:val="22"/>
-          <w:szCs w:val="22"/>
-          <w:lang w:val="nl-NL"/>
-        </w:rPr>
-        <w:t>.</w:t>
-      </w:r>
-      <w:r>
-        <w:rPr>
-          <w:rFonts w:ascii="Courier New" w:hAnsi="Courier New" w:cs="Courier New"/>
-          <w:sz w:val="22"/>
-          <w:szCs w:val="22"/>
-          <w:lang w:val="nl-NL"/>
-        </w:rPr>
-        <w:t xml:space="preserve"> Daar is sprake van in een bepaalde periode in de Italiaanse stadsstaten, bij het werk van enkele Middeleeuwse juristen en in de periode na de Tweede Wereldoorlog waarin er meer gelijkheid kwam. Het onderwerp is terug op de agenda via mensen als </w:t>
-      </w:r>
-      <w:proofErr w:type="spellStart"/>
-      <w:r>
-        <w:rPr>
-          <w:rFonts w:ascii="Courier New" w:hAnsi="Courier New" w:cs="Courier New"/>
-          <w:sz w:val="22"/>
-          <w:szCs w:val="22"/>
-          <w:lang w:val="nl-NL"/>
-        </w:rPr>
-        <w:t>Piketty</w:t>
-      </w:r>
-      <w:proofErr w:type="spellEnd"/>
-      <w:r>
-        <w:rPr>
-          <w:rFonts w:ascii="Courier New" w:hAnsi="Courier New" w:cs="Courier New"/>
-          <w:sz w:val="22"/>
-          <w:szCs w:val="22"/>
-          <w:lang w:val="nl-NL"/>
-        </w:rPr>
-        <w:t xml:space="preserve">, </w:t>
-      </w:r>
-      <w:proofErr w:type="spellStart"/>
-      <w:r>
-        <w:rPr>
-          <w:rFonts w:ascii="Courier New" w:hAnsi="Courier New" w:cs="Courier New"/>
-          <w:sz w:val="22"/>
-          <w:szCs w:val="22"/>
-          <w:lang w:val="nl-NL"/>
-        </w:rPr>
-        <w:t>Zucman</w:t>
-      </w:r>
-      <w:proofErr w:type="spellEnd"/>
-      <w:r>
-        <w:rPr>
-          <w:rFonts w:ascii="Courier New" w:hAnsi="Courier New" w:cs="Courier New"/>
-          <w:sz w:val="22"/>
-          <w:szCs w:val="22"/>
-          <w:lang w:val="nl-NL"/>
-        </w:rPr>
-        <w:t xml:space="preserve"> en ook Kooistra. Door het vraagstuk </w:t>
-      </w:r>
-    </w:p>
-    <w:p>
-      <w:pPr>
-        <w:spacing w:line="360" w:lineRule="auto"/>
-        <w:rPr>
-          <w:rFonts w:ascii="Courier New" w:hAnsi="Courier New" w:cs="Courier New"/>
-          <w:sz w:val="22"/>
-          <w:szCs w:val="22"/>
-          <w:lang w:val="nl-NL"/>
-        </w:rPr>
-      </w:pPr>
-      <w:proofErr w:type="spellStart"/>
-      <w:r>
-        <w:rPr>
-          <w:rFonts w:ascii="Courier New" w:hAnsi="Courier New" w:cs="Courier New"/>
-          <w:sz w:val="22"/>
-          <w:szCs w:val="22"/>
-          <w:lang w:val="nl-NL"/>
-        </w:rPr>
-        <w:t>Zucman</w:t>
-      </w:r>
-      <w:proofErr w:type="spellEnd"/>
-    </w:p>
-    <w:p>
-      <w:pPr>
-        <w:spacing w:line="360" w:lineRule="auto"/>
-        <w:rPr>
-          <w:rFonts w:ascii="Courier New" w:hAnsi="Courier New" w:cs="Courier New"/>
-          <w:sz w:val="22"/>
-          <w:szCs w:val="22"/>
-          <w:lang w:val="nl-NL"/>
-        </w:rPr>
-      </w:pPr>
     </w:p>
     <w:p>
       <w:pPr>

</xml_diff>